<commit_message>
Add dashboard screenshot and update reports
</commit_message>
<xml_diff>
--- a/reports/Laporan_Gabungan_Data_Storytelling_Halal_Final.docx
+++ b/reports/Laporan_Gabungan_Data_Storytelling_Halal_Final.docx
@@ -2,7 +2,7 @@
 <file path=word/document.xml><?xml version="1.0" encoding="utf-8"?>
 <w:document xmlns:w="http://schemas.openxmlformats.org/wordprocessingml/2006/main" xmlns:m="http://schemas.openxmlformats.org/officeDocument/2006/math" xmlns:r="http://schemas.openxmlformats.org/officeDocument/2006/relationships" xmlns:o="urn:schemas-microsoft-com:office:office" xmlns:v="urn:schemas-microsoft-com:vml" xmlns:w10="urn:schemas-microsoft-com:office:word" xmlns:a="http://schemas.openxmlformats.org/drawingml/2006/main" xmlns:pic="http://schemas.openxmlformats.org/drawingml/2006/picture" xmlns:wp="http://schemas.openxmlformats.org/drawingml/2006/wordprocessingDrawing">
   <w:body>
-    <w:bookmarkStart w:id="76" w:name="X19dcd93239a5d7fbec1342a4c6d23dd49ec46a0"/>
+    <w:bookmarkStart w:id="79" w:name="X19dcd93239a5d7fbec1342a4c6d23dd49ec46a0"/>
     <w:p>
       <w:pPr>
         <w:pStyle w:val="Heading1"/>
@@ -7490,7 +7490,7 @@
     </w:p>
     <w:bookmarkEnd w:id="30"/>
     <w:bookmarkEnd w:id="31"/>
-    <w:bookmarkStart w:id="62" w:name="bab-iv-hasil-dan-pembahasan"/>
+    <w:bookmarkStart w:id="65" w:name="bab-iv-hasil-dan-pembahasan"/>
     <w:p>
       <w:pPr>
         <w:pStyle w:val="Heading2"/>
@@ -12085,7 +12085,7 @@
       </w:r>
     </w:p>
     <w:bookmarkEnd w:id="45"/>
-    <w:bookmarkStart w:id="59" w:name="X4192c41f03f2ecff0bf2ced2a95f639f26b9287"/>
+    <w:bookmarkStart w:id="62" w:name="X4192c41f03f2ecff0bf2ced2a95f639f26b9287"/>
     <w:p>
       <w:pPr>
         <w:pStyle w:val="Heading3"/>
@@ -12850,7 +12850,85 @@
           <w:rFonts w:ascii="Times New Roman" w:hAnsi="Times New Roman"/>
           <w:sz w:val="24"/>
         </w:rPr>
-        <w:t xml:space="preserve">. Dashboard ini menyediakan eksplorasi visual interaktif yang membantu membumikan hasil pemodelan spektral bagi pengguna:</w:t>
+        <w:t xml:space="preserve">.</w:t>
+      </w:r>
+    </w:p>
+    <w:p>
+      <w:pPr>
+        <w:pStyle w:val="CaptionedFigure"/>
+        <w:jc w:val="both"/>
+      </w:pPr>
+      <w:r>
+        <w:rPr>
+          <w:rFonts w:ascii="Times New Roman" w:hAnsi="Times New Roman"/>
+          <w:sz w:val="24"/>
+        </w:rPr>
+        <w:drawing>
+          <wp:inline>
+            <wp:extent cx="5334000" cy="2922240"/>
+            <wp:effectExtent b="0" l="0" r="0" t="0"/>
+            <wp:docPr descr="Purwarupa Web Dashboard Interaktif - Halal Analyzer" title="" id="60" name="Picture"/>
+            <a:graphic>
+              <a:graphicData uri="http://schemas.openxmlformats.org/drawingml/2006/picture">
+                <pic:pic>
+                  <pic:nvPicPr>
+                    <pic:cNvPr descr="output_halal/fig6_web_dashboard.png" id="61" name="Picture"/>
+                    <pic:cNvPicPr>
+                      <a:picLocks noChangeArrowheads="1" noChangeAspect="1"/>
+                    </pic:cNvPicPr>
+                  </pic:nvPicPr>
+                  <pic:blipFill>
+                    <a:blip r:embed="rId59"/>
+                    <a:stretch>
+                      <a:fillRect/>
+                    </a:stretch>
+                  </pic:blipFill>
+                  <pic:spPr bwMode="auto">
+                    <a:xfrm>
+                      <a:off x="0" y="0"/>
+                      <a:ext cx="5334000" cy="2922240"/>
+                    </a:xfrm>
+                    <a:prstGeom prst="rect">
+                      <a:avLst/>
+                    </a:prstGeom>
+                    <a:noFill/>
+                    <a:ln w="9525">
+                      <a:noFill/>
+                      <a:headEnd/>
+                      <a:tailEnd/>
+                    </a:ln>
+                  </pic:spPr>
+                </pic:pic>
+              </a:graphicData>
+            </a:graphic>
+          </wp:inline>
+        </w:drawing>
+      </w:r>
+    </w:p>
+    <w:p>
+      <w:pPr>
+        <w:pStyle w:val="ImageCaption"/>
+        <w:jc w:val="both"/>
+      </w:pPr>
+      <w:r>
+        <w:rPr>
+          <w:rFonts w:ascii="Times New Roman" w:hAnsi="Times New Roman"/>
+          <w:sz w:val="24"/>
+        </w:rPr>
+        <w:t xml:space="preserve">Purwarupa Web Dashboard Interaktif - Halal Analyzer</w:t>
+      </w:r>
+    </w:p>
+    <w:p>
+      <w:pPr>
+        <w:pStyle w:val="BodyText"/>
+        <w:jc w:val="both"/>
+      </w:pPr>
+      <w:r>
+        <w:rPr>
+          <w:rFonts w:ascii="Times New Roman" w:hAnsi="Times New Roman"/>
+          <w:sz w:val="24"/>
+        </w:rPr>
+        <w:t xml:space="preserve">Dashboard ini menyediakan eksplorasi visual interaktif yang membantu membumikan hasil pemodelan spektral bagi pengguna:</w:t>
       </w:r>
       <w:r>
         <w:rPr>
@@ -12987,8 +13065,8 @@
         </w:pict>
       </w:r>
     </w:p>
-    <w:bookmarkEnd w:id="59"/>
-    <w:bookmarkStart w:id="60" w:name="temuan-utama-data-storytelling-insights"/>
+    <w:bookmarkEnd w:id="62"/>
+    <w:bookmarkStart w:id="63" w:name="temuan-utama-data-storytelling-insights"/>
     <w:p>
       <w:pPr>
         <w:pStyle w:val="Heading3"/>
@@ -13551,8 +13629,8 @@
         </w:pict>
       </w:r>
     </w:p>
-    <w:bookmarkEnd w:id="60"/>
-    <w:bookmarkStart w:id="61" w:name="tabel-ringkasan-risiko-klaster-halal"/>
+    <w:bookmarkEnd w:id="63"/>
+    <w:bookmarkStart w:id="64" w:name="tabel-ringkasan-risiko-klaster-halal"/>
     <w:p>
       <w:pPr>
         <w:pStyle w:val="Heading3"/>
@@ -14477,9 +14555,9 @@
         </w:tc>
       </w:tr>
     </w:tbl>
-    <w:bookmarkEnd w:id="61"/>
-    <w:bookmarkEnd w:id="62"/>
-    <w:bookmarkStart w:id="65" w:name="bab-v-kesimpulan-dan-saran"/>
+    <w:bookmarkEnd w:id="64"/>
+    <w:bookmarkEnd w:id="65"/>
+    <w:bookmarkStart w:id="68" w:name="bab-v-kesimpulan-dan-saran"/>
     <w:p>
       <w:pPr>
         <w:pStyle w:val="Heading2"/>
@@ -14491,7 +14569,7 @@
         <w:t xml:space="preserve">BAB V: KESIMPULAN DAN SARAN</w:t>
       </w:r>
     </w:p>
-    <w:bookmarkStart w:id="63" w:name="kesimpulan"/>
+    <w:bookmarkStart w:id="66" w:name="kesimpulan"/>
     <w:p>
       <w:pPr>
         <w:pStyle w:val="Heading3"/>
@@ -14912,8 +14990,8 @@
         <w:t xml:space="preserve">Karakterisasi 8 klaster pangan riil berhasil memetakan titik kritis kehalalan (CCP) secara spesifik, memudahkan auditor halal fokus pada bahan kritis utama di masing-masing klaster (misalnya, L-sistein pada klaster tepung, gelatin pada klaster buah/jus, dan penyembelihan RPH pada klaster daging).</w:t>
       </w:r>
     </w:p>
-    <w:bookmarkEnd w:id="63"/>
-    <w:bookmarkStart w:id="64" w:name="saran"/>
+    <w:bookmarkEnd w:id="66"/>
+    <w:bookmarkStart w:id="67" w:name="saran"/>
     <w:p>
       <w:pPr>
         <w:pStyle w:val="Heading3"/>
@@ -15144,9 +15222,9 @@
         </w:pict>
       </w:r>
     </w:p>
-    <w:bookmarkEnd w:id="64"/>
-    <w:bookmarkEnd w:id="65"/>
-    <w:bookmarkStart w:id="66" w:name="daftar-pustaka"/>
+    <w:bookmarkEnd w:id="67"/>
+    <w:bookmarkEnd w:id="68"/>
+    <w:bookmarkStart w:id="69" w:name="daftar-pustaka"/>
     <w:p>
       <w:pPr>
         <w:pStyle w:val="Heading2"/>
@@ -15508,8 +15586,8 @@
         </w:pict>
       </w:r>
     </w:p>
-    <w:bookmarkEnd w:id="66"/>
-    <w:bookmarkStart w:id="75" w:name="X6c949f68e861d744fc1e57c0bae665ba8ffc7c8"/>
+    <w:bookmarkEnd w:id="69"/>
+    <w:bookmarkStart w:id="78" w:name="X6c949f68e861d744fc1e57c0bae665ba8ffc7c8"/>
     <w:p>
       <w:pPr>
         <w:pStyle w:val="Heading2"/>
@@ -15534,7 +15612,7 @@
         <w:t xml:space="preserve">Untuk mendukung kesiapan tim dalam mempresentasikan laporan gabungan Analisis Data Multivariat ini di hadapan dewan penguji, bagian lampiran ini merangkum pertanyaan-pertanyaan kritis beserta kunci jawaban ilmiah berbasis data dan rancangan kode program:</w:t>
       </w:r>
     </w:p>
-    <w:bookmarkStart w:id="70" w:name="X978cb742b478b737e89431c04a630b8e503d09d"/>
+    <w:bookmarkStart w:id="73" w:name="X978cb742b478b737e89431c04a630b8e503d09d"/>
     <w:p>
       <w:pPr>
         <w:pStyle w:val="Heading3"/>
@@ -15546,7 +15624,7 @@
         <w:t xml:space="preserve">Sesi A: Landasan Matematis &amp; Metodologi Reduksi Dimensi</w:t>
       </w:r>
     </w:p>
-    <w:bookmarkStart w:id="67" w:name="Xa9e828d0fb7d5a9d351f0175fcb8d724b38350c"/>
+    <w:bookmarkStart w:id="70" w:name="Xa9e828d0fb7d5a9d351f0175fcb8d724b38350c"/>
     <w:p>
       <w:pPr>
         <w:pStyle w:val="Heading4"/>
@@ -15846,8 +15924,8 @@
         <w:t xml:space="preserve">yang menormalkan bobot kolom (bahan langka seperti gelatin babi diberi bobot lebih besar, sedangkan air/garam diredam) dan tidak menghitung kemunculan nol sebagai kemiripan resep.</w:t>
       </w:r>
     </w:p>
-    <w:bookmarkEnd w:id="67"/>
-    <w:bookmarkStart w:id="68" w:name="Xc6bc25995e99c99c37716001649a2f510cc3022"/>
+    <w:bookmarkEnd w:id="70"/>
+    <w:bookmarkStart w:id="71" w:name="Xc6bc25995e99c99c37716001649a2f510cc3022"/>
     <w:p>
       <w:pPr>
         <w:pStyle w:val="Heading4"/>
@@ -16132,8 +16210,8 @@
         <w:t xml:space="preserve">).</w:t>
       </w:r>
     </w:p>
-    <w:bookmarkEnd w:id="68"/>
-    <w:bookmarkStart w:id="69" w:name="X2450c0491191c5e0c75e03836b5546c9e3ff05c"/>
+    <w:bookmarkEnd w:id="71"/>
+    <w:bookmarkStart w:id="72" w:name="X2450c0491191c5e0c75e03836b5546c9e3ff05c"/>
     <w:p>
       <w:pPr>
         <w:pStyle w:val="Heading4"/>
@@ -16616,9 +16694,9 @@
         </w:pict>
       </w:r>
     </w:p>
-    <w:bookmarkEnd w:id="69"/>
-    <w:bookmarkEnd w:id="70"/>
-    <w:bookmarkStart w:id="74" w:name="X4131c911fb1dcf5ecabfeb5209583df7af83f53"/>
+    <w:bookmarkEnd w:id="72"/>
+    <w:bookmarkEnd w:id="73"/>
+    <w:bookmarkStart w:id="77" w:name="X4131c911fb1dcf5ecabfeb5209583df7af83f53"/>
     <w:p>
       <w:pPr>
         <w:pStyle w:val="Heading3"/>
@@ -16630,7 +16708,7 @@
         <w:t xml:space="preserve">Sesi B: Narasi Storytelling &amp; Hasil Klasterisasi</w:t>
       </w:r>
     </w:p>
-    <w:bookmarkStart w:id="71" w:name="X2a1f5b3f0bfcecd21f619262144e9a32b838681"/>
+    <w:bookmarkStart w:id="74" w:name="X2a1f5b3f0bfcecd21f619262144e9a32b838681"/>
     <w:p>
       <w:pPr>
         <w:pStyle w:val="Heading4"/>
@@ -17002,8 +17080,8 @@
         <w:t xml:space="preserve">bahan syubhat).</w:t>
       </w:r>
     </w:p>
-    <w:bookmarkEnd w:id="71"/>
-    <w:bookmarkStart w:id="72" w:name="X73a165f8f499be52ec40003b3921bc36054d1e1"/>
+    <w:bookmarkEnd w:id="74"/>
+    <w:bookmarkStart w:id="75" w:name="X73a165f8f499be52ec40003b3921bc36054d1e1"/>
     <w:p>
       <w:pPr>
         <w:pStyle w:val="Heading4"/>
@@ -17379,8 +17457,8 @@
         <w:t xml:space="preserve">).</w:t>
       </w:r>
     </w:p>
-    <w:bookmarkEnd w:id="72"/>
-    <w:bookmarkStart w:id="73" w:name="X5a446dc03dce1c4038fcf5785fb4b6f7be5b341"/>
+    <w:bookmarkEnd w:id="75"/>
+    <w:bookmarkStart w:id="76" w:name="X5a446dc03dce1c4038fcf5785fb4b6f7be5b341"/>
     <w:p>
       <w:pPr>
         <w:pStyle w:val="Heading4"/>
@@ -17500,10 +17578,10 @@
         <w:t xml:space="preserve">: Mengintegrasikan sistem penapisan otomatis berbasis risiko komposisi digital pada portal SIHALAL untuk menyaring bahan baku rawan haram saat produsen mendaftarkan resep baru.</w:t>
       </w:r>
     </w:p>
-    <w:bookmarkEnd w:id="73"/>
-    <w:bookmarkEnd w:id="74"/>
-    <w:bookmarkEnd w:id="75"/>
     <w:bookmarkEnd w:id="76"/>
+    <w:bookmarkEnd w:id="77"/>
+    <w:bookmarkEnd w:id="78"/>
+    <w:bookmarkEnd w:id="79"/>
     <w:sectPr>
       <w:footnotePr>
         <w:numRestart w:val="eachSect"/>

</xml_diff>

<commit_message>
Render flowchart as image in markdown and docx, update requirements.txt
</commit_message>
<xml_diff>
--- a/reports/Laporan_Gabungan_Data_Storytelling_Halal_Final.docx
+++ b/reports/Laporan_Gabungan_Data_Storytelling_Halal_Final.docx
@@ -2,7 +2,7 @@
 <file path=word/document.xml><?xml version="1.0" encoding="utf-8"?>
 <w:document xmlns:w="http://schemas.openxmlformats.org/wordprocessingml/2006/main" xmlns:m="http://schemas.openxmlformats.org/officeDocument/2006/math" xmlns:r="http://schemas.openxmlformats.org/officeDocument/2006/relationships" xmlns:o="urn:schemas-microsoft-com:office:office" xmlns:v="urn:schemas-microsoft-com:vml" xmlns:w10="urn:schemas-microsoft-com:office:word" xmlns:a="http://schemas.openxmlformats.org/drawingml/2006/main" xmlns:pic="http://schemas.openxmlformats.org/drawingml/2006/picture" xmlns:wp="http://schemas.openxmlformats.org/drawingml/2006/wordprocessingDrawing">
   <w:body>
-    <w:bookmarkStart w:id="79" w:name="X19dcd93239a5d7fbec1342a4c6d23dd49ec46a0"/>
+    <w:bookmarkStart w:id="82" w:name="X19dcd93239a5d7fbec1342a4c6d23dd49ec46a0"/>
     <w:p>
       <w:pPr>
         <w:pStyle w:val="Heading1"/>
@@ -3662,7 +3662,7 @@
     </w:p>
     <w:bookmarkEnd w:id="20"/>
     <w:bookmarkEnd w:id="21"/>
-    <w:bookmarkStart w:id="31" w:name="bab-iii-metodologi-penelitian"/>
+    <w:bookmarkStart w:id="34" w:name="bab-iii-metodologi-penelitian"/>
     <w:p>
       <w:pPr>
         <w:pStyle w:val="Heading2"/>
@@ -3730,7 +3730,7 @@
       </w:r>
     </w:p>
     <w:bookmarkEnd w:id="22"/>
-    <w:bookmarkStart w:id="23" w:name="X7dca970b2523315aa86408a4771b4fdfce1d8ca"/>
+    <w:bookmarkStart w:id="26" w:name="X7dca970b2523315aa86408a4771b4fdfce1d8ca"/>
     <w:p>
       <w:pPr>
         <w:pStyle w:val="Heading3"/>
@@ -3744,170 +3744,71 @@
     </w:p>
     <w:p>
       <w:pPr>
-        <w:pStyle w:val="SourceCode"/>
-        <w:jc w:val="both"/>
-      </w:pPr>
-      <w:r>
-        <w:rPr>
-          <w:rStyle w:val="VerbatimChar"/>
-          <w:rFonts w:ascii="Times New Roman" w:hAnsi="Times New Roman"/>
-          <w:sz w:val="24"/>
-        </w:rPr>
-        <w:t xml:space="preserve">graph TD</w:t>
-      </w:r>
-      <w:r>
-        <w:rPr>
-          <w:rFonts w:ascii="Times New Roman" w:hAnsi="Times New Roman"/>
-          <w:sz w:val="24"/>
-        </w:rPr>
-        <w:br/>
-      </w:r>
-      <w:r>
-        <w:rPr>
-          <w:rStyle w:val="VerbatimChar"/>
-          <w:rFonts w:ascii="Times New Roman" w:hAnsi="Times New Roman"/>
-          <w:sz w:val="24"/>
-        </w:rPr>
-        <w:t xml:space="preserve">    A[Dataset Mentah Pangan Halal N=15.739] --&gt; B[Binerisasi Komposisi Top 500 Ingredients]</w:t>
-      </w:r>
-      <w:r>
-        <w:rPr>
-          <w:rFonts w:ascii="Times New Roman" w:hAnsi="Times New Roman"/>
-          <w:sz w:val="24"/>
-        </w:rPr>
-        <w:br/>
-      </w:r>
-      <w:r>
-        <w:rPr>
-          <w:rStyle w:val="VerbatimChar"/>
-          <w:rFonts w:ascii="Times New Roman" w:hAnsi="Times New Roman"/>
-          <w:sz w:val="24"/>
-        </w:rPr>
-        <w:t xml:space="preserve">    B --&gt; C[Multiple Correspondence Analysis - MCA]</w:t>
-      </w:r>
-      <w:r>
-        <w:rPr>
-          <w:rFonts w:ascii="Times New Roman" w:hAnsi="Times New Roman"/>
-          <w:sz w:val="24"/>
-        </w:rPr>
-        <w:br/>
-      </w:r>
-      <w:r>
-        <w:rPr>
-          <w:rStyle w:val="VerbatimChar"/>
-          <w:rFonts w:ascii="Times New Roman" w:hAnsi="Times New Roman"/>
-          <w:sz w:val="24"/>
-        </w:rPr>
-        <w:t xml:space="preserve">    C --&gt; D[Kaiser Criterion &amp; Koreksi Greenacre]</w:t>
-      </w:r>
-      <w:r>
-        <w:rPr>
-          <w:rFonts w:ascii="Times New Roman" w:hAnsi="Times New Roman"/>
-          <w:sz w:val="24"/>
-        </w:rPr>
-        <w:br/>
-      </w:r>
-      <w:r>
-        <w:rPr>
-          <w:rStyle w:val="VerbatimChar"/>
-          <w:rFonts w:ascii="Times New Roman" w:hAnsi="Times New Roman"/>
-          <w:sz w:val="24"/>
-        </w:rPr>
-        <w:t xml:space="preserve">    D --&gt;|8 Komponen MCA| E[Konstruksi Sparse RBF Adjacency Graph 100-NN]</w:t>
-      </w:r>
-      <w:r>
-        <w:rPr>
-          <w:rFonts w:ascii="Times New Roman" w:hAnsi="Times New Roman"/>
-          <w:sz w:val="24"/>
-        </w:rPr>
-        <w:br/>
-      </w:r>
-      <w:r>
-        <w:rPr>
-          <w:rStyle w:val="VerbatimChar"/>
-          <w:rFonts w:ascii="Times New Roman" w:hAnsi="Times New Roman"/>
-          <w:sz w:val="24"/>
-        </w:rPr>
-        <w:t xml:space="preserve">    E --&gt; F[Spectral Clustering K=8 via LOBPCG Solver]</w:t>
-      </w:r>
-      <w:r>
-        <w:rPr>
-          <w:rFonts w:ascii="Times New Roman" w:hAnsi="Times New Roman"/>
-          <w:sz w:val="24"/>
-        </w:rPr>
-        <w:br/>
-      </w:r>
-      <w:r>
-        <w:rPr>
-          <w:rStyle w:val="VerbatimChar"/>
-          <w:rFonts w:ascii="Times New Roman" w:hAnsi="Times New Roman"/>
-          <w:sz w:val="24"/>
-        </w:rPr>
-        <w:t xml:space="preserve">    C --&gt; G[K-Means Clustering K=8 via Euclidean Space]</w:t>
-      </w:r>
-      <w:r>
-        <w:rPr>
-          <w:rFonts w:ascii="Times New Roman" w:hAnsi="Times New Roman"/>
-          <w:sz w:val="24"/>
-        </w:rPr>
-        <w:br/>
-      </w:r>
-      <w:r>
-        <w:rPr>
-          <w:rStyle w:val="VerbatimChar"/>
-          <w:rFonts w:ascii="Times New Roman" w:hAnsi="Times New Roman"/>
-          <w:sz w:val="24"/>
-        </w:rPr>
-        <w:t xml:space="preserve">    F --&gt; H[Evaluasi Metrik Komparatif Graf &amp; Halal]</w:t>
-      </w:r>
-      <w:r>
-        <w:rPr>
-          <w:rFonts w:ascii="Times New Roman" w:hAnsi="Times New Roman"/>
-          <w:sz w:val="24"/>
-        </w:rPr>
-        <w:br/>
-      </w:r>
-      <w:r>
-        <w:rPr>
-          <w:rStyle w:val="VerbatimChar"/>
-          <w:rFonts w:ascii="Times New Roman" w:hAnsi="Times New Roman"/>
-          <w:sz w:val="24"/>
-        </w:rPr>
-        <w:t xml:space="preserve">    G --&gt; H</w:t>
-      </w:r>
-      <w:r>
-        <w:rPr>
-          <w:rFonts w:ascii="Times New Roman" w:hAnsi="Times New Roman"/>
-          <w:sz w:val="24"/>
-        </w:rPr>
-        <w:br/>
-      </w:r>
-      <w:r>
-        <w:rPr>
-          <w:rStyle w:val="VerbatimChar"/>
-          <w:rFonts w:ascii="Times New Roman" w:hAnsi="Times New Roman"/>
-          <w:sz w:val="24"/>
-        </w:rPr>
-        <w:t xml:space="preserve">    F --&gt; I[Proyeksi Visualisasi UMAP 2D]</w:t>
-      </w:r>
-      <w:r>
-        <w:rPr>
-          <w:rFonts w:ascii="Times New Roman" w:hAnsi="Times New Roman"/>
-          <w:sz w:val="24"/>
-        </w:rPr>
-        <w:br/>
-      </w:r>
-      <w:r>
-        <w:rPr>
-          <w:rStyle w:val="VerbatimChar"/>
-          <w:rFonts w:ascii="Times New Roman" w:hAnsi="Times New Roman"/>
-          <w:sz w:val="24"/>
-        </w:rPr>
-        <w:t xml:space="preserve">    I --&gt; J[Dashboard Visual Interaktif]</w:t>
-      </w:r>
-    </w:p>
-    <w:bookmarkEnd w:id="23"/>
-    <w:bookmarkStart w:id="26" w:name="sumber-data"/>
+        <w:pStyle w:val="CaptionedFigure"/>
+        <w:jc w:val="both"/>
+      </w:pPr>
+      <w:r>
+        <w:rPr>
+          <w:rFonts w:ascii="Times New Roman" w:hAnsi="Times New Roman"/>
+          <w:sz w:val="24"/>
+        </w:rPr>
+        <w:drawing>
+          <wp:inline>
+            <wp:extent cx="5334000" cy="3969070"/>
+            <wp:effectExtent b="0" l="0" r="0" t="0"/>
+            <wp:docPr descr="Diagram Alir Penelitian" title="" id="24" name="Picture"/>
+            <a:graphic>
+              <a:graphicData uri="http://schemas.openxmlformats.org/drawingml/2006/picture">
+                <pic:pic>
+                  <pic:nvPicPr>
+                    <pic:cNvPr descr="output_halal/fig0_flowchart.png" id="25" name="Picture"/>
+                    <pic:cNvPicPr>
+                      <a:picLocks noChangeArrowheads="1" noChangeAspect="1"/>
+                    </pic:cNvPicPr>
+                  </pic:nvPicPr>
+                  <pic:blipFill>
+                    <a:blip r:embed="rId23"/>
+                    <a:stretch>
+                      <a:fillRect/>
+                    </a:stretch>
+                  </pic:blipFill>
+                  <pic:spPr bwMode="auto">
+                    <a:xfrm>
+                      <a:off x="0" y="0"/>
+                      <a:ext cx="5334000" cy="3969070"/>
+                    </a:xfrm>
+                    <a:prstGeom prst="rect">
+                      <a:avLst/>
+                    </a:prstGeom>
+                    <a:noFill/>
+                    <a:ln w="9525">
+                      <a:noFill/>
+                      <a:headEnd/>
+                      <a:tailEnd/>
+                    </a:ln>
+                  </pic:spPr>
+                </pic:pic>
+              </a:graphicData>
+            </a:graphic>
+          </wp:inline>
+        </w:drawing>
+      </w:r>
+    </w:p>
+    <w:p>
+      <w:pPr>
+        <w:pStyle w:val="ImageCaption"/>
+        <w:jc w:val="both"/>
+      </w:pPr>
+      <w:r>
+        <w:rPr>
+          <w:rFonts w:ascii="Times New Roman" w:hAnsi="Times New Roman"/>
+          <w:sz w:val="24"/>
+        </w:rPr>
+        <w:t xml:space="preserve">Diagram Alir Penelitian</w:t>
+      </w:r>
+    </w:p>
+    <w:bookmarkEnd w:id="26"/>
+    <w:bookmarkStart w:id="29" w:name="sumber-data"/>
     <w:p>
       <w:pPr>
         <w:pStyle w:val="Heading3"/>
@@ -3998,7 +3899,7 @@
         </w:rPr>
         <w:t xml:space="preserve"> </w:t>
       </w:r>
-      <w:hyperlink r:id="rId24">
+      <w:hyperlink r:id="rId27">
         <w:r>
           <w:rPr>
             <w:rStyle w:val="Hyperlink"/>
@@ -4044,7 +3945,7 @@
         <w:t xml:space="preserve">.</w:t>
       </w:r>
     </w:p>
-    <w:bookmarkStart w:id="25" w:name="ringkasan-volume-data"/>
+    <w:bookmarkStart w:id="28" w:name="ringkasan-volume-data"/>
     <w:p>
       <w:pPr>
         <w:pStyle w:val="Heading4"/>
@@ -4221,9 +4122,9 @@
         <w:t xml:space="preserve">3 lembaga (termasuk LPPOM-MUI)</w:t>
       </w:r>
     </w:p>
-    <w:bookmarkEnd w:id="25"/>
-    <w:bookmarkEnd w:id="26"/>
-    <w:bookmarkStart w:id="27" w:name="X5959ecb50353c5e5a6c94e93ef6bd380f7a69c8"/>
+    <w:bookmarkEnd w:id="28"/>
+    <w:bookmarkEnd w:id="29"/>
+    <w:bookmarkStart w:id="30" w:name="X5959ecb50353c5e5a6c94e93ef6bd380f7a69c8"/>
     <w:p>
       <w:pPr>
         <w:pStyle w:val="Heading3"/>
@@ -5350,8 +5251,8 @@
         <w:t xml:space="preserve">produk pangan, yang mencakup informasi produk, kadar nutrisi, status sertifikat, dan string bahan baku yang dipisahkan koma.</w:t>
       </w:r>
     </w:p>
-    <w:bookmarkEnd w:id="27"/>
-    <w:bookmarkStart w:id="28" w:name="proses-data-wrangling-preprocessing"/>
+    <w:bookmarkEnd w:id="30"/>
+    <w:bookmarkStart w:id="31" w:name="proses-data-wrangling-preprocessing"/>
     <w:p>
       <w:pPr>
         <w:pStyle w:val="Heading3"/>
@@ -6783,8 +6684,8 @@
         <w:t xml:space="preserve">Melakukan kalkulasi persentase data bernilai non-nol pada variabel gizi pangan komersial untuk mengevaluasi kelayakannya dalam analisis multivariat.</w:t>
       </w:r>
     </w:p>
-    <w:bookmarkEnd w:id="28"/>
-    <w:bookmarkStart w:id="29" w:name="Xe3e3034830e149af8b9f03652f79f1bdc0f5ad2"/>
+    <w:bookmarkEnd w:id="31"/>
+    <w:bookmarkStart w:id="32" w:name="Xe3e3034830e149af8b9f03652f79f1bdc0f5ad2"/>
     <w:p>
       <w:pPr>
         <w:pStyle w:val="Heading3"/>
@@ -7131,8 +7032,8 @@
         <w:t xml:space="preserve">resmi dipertahankan.</w:t>
       </w:r>
     </w:p>
-    <w:bookmarkEnd w:id="29"/>
-    <w:bookmarkStart w:id="30" w:name="parameter-pemodelan"/>
+    <w:bookmarkEnd w:id="32"/>
+    <w:bookmarkStart w:id="33" w:name="parameter-pemodelan"/>
     <w:p>
       <w:pPr>
         <w:pStyle w:val="Heading3"/>
@@ -7488,9 +7389,9 @@
         </w:pict>
       </w:r>
     </w:p>
-    <w:bookmarkEnd w:id="30"/>
-    <w:bookmarkEnd w:id="31"/>
-    <w:bookmarkStart w:id="65" w:name="bab-iv-hasil-dan-pembahasan"/>
+    <w:bookmarkEnd w:id="33"/>
+    <w:bookmarkEnd w:id="34"/>
+    <w:bookmarkStart w:id="68" w:name="bab-iv-hasil-dan-pembahasan"/>
     <w:p>
       <w:pPr>
         <w:pStyle w:val="Heading2"/>
@@ -7502,7 +7403,7 @@
         <w:t xml:space="preserve">BAB IV: HASIL DAN PEMBAHASAN</w:t>
       </w:r>
     </w:p>
-    <w:bookmarkStart w:id="32" w:name="Xce1fc639367fb367f9c44fedb51297fcfb1b931"/>
+    <w:bookmarkStart w:id="35" w:name="Xce1fc639367fb367f9c44fedb51297fcfb1b931"/>
     <w:p>
       <w:pPr>
         <w:pStyle w:val="Heading3"/>
@@ -7731,8 +7632,8 @@
         <w:t xml:space="preserve">Matriks ko-kemunculan menunjukkan bahan baku dominan saling berpasangan secara teratur (Salt dan Water muncul bersama sebanyak 3.655 kali, Salt dan Sugar sebanyak 2.162 kali). Ini membuktikan bahwa bahan pangan tersebar secara non-random dan membentuk pola graf ketetanggaan yang terstruktur.</w:t>
       </w:r>
     </w:p>
-    <w:bookmarkEnd w:id="32"/>
-    <w:bookmarkStart w:id="33" w:name="tabel-uji-metrik-komparatif-riil"/>
+    <w:bookmarkEnd w:id="35"/>
+    <w:bookmarkStart w:id="36" w:name="tabel-uji-metrik-komparatif-riil"/>
     <w:p>
       <w:pPr>
         <w:pStyle w:val="Heading3"/>
@@ -8734,8 +8635,8 @@
         </w:tc>
       </w:tr>
     </w:tbl>
-    <w:bookmarkEnd w:id="33"/>
-    <w:bookmarkStart w:id="34" w:name="analisis-kritis-perbandingan-metrik"/>
+    <w:bookmarkEnd w:id="36"/>
+    <w:bookmarkStart w:id="37" w:name="analisis-kritis-perbandingan-metrik"/>
     <w:p>
       <w:pPr>
         <w:pStyle w:val="Heading3"/>
@@ -9059,8 +8960,8 @@
         <w:t xml:space="preserve">) yang meroket tinggi juga menegaskan bahwa klaster yang dibentuk oleh konektivitas graf Spectral Clustering memiliki hubungan yang terbukti eksponensial lebih kuat dengan status kehalalan objektif produk dibanding pembagian bola acak K-Means.</w:t>
       </w:r>
     </w:p>
-    <w:bookmarkEnd w:id="34"/>
-    <w:bookmarkStart w:id="35" w:name="Xc35162a9fe35c78c0411dfaae2d8fbbcdfa54e1"/>
+    <w:bookmarkEnd w:id="37"/>
+    <w:bookmarkStart w:id="38" w:name="Xc35162a9fe35c78c0411dfaae2d8fbbcdfa54e1"/>
     <w:p>
       <w:pPr>
         <w:pStyle w:val="Heading3"/>
@@ -11687,8 +11588,8 @@
         </w:pict>
       </w:r>
     </w:p>
-    <w:bookmarkEnd w:id="35"/>
-    <w:bookmarkStart w:id="45" w:name="peta-spektral-visualisasi-permodelan"/>
+    <w:bookmarkEnd w:id="38"/>
+    <w:bookmarkStart w:id="48" w:name="peta-spektral-visualisasi-permodelan"/>
     <w:p>
       <w:pPr>
         <w:pStyle w:val="Heading3"/>
@@ -11763,18 +11664,18 @@
           <wp:inline>
             <wp:extent cx="5334000" cy="4000500"/>
             <wp:effectExtent b="0" l="0" r="0" t="0"/>
-            <wp:docPr descr="Peta Spektral Cluster Pangan Komersial" title="" id="37" name="Picture"/>
+            <wp:docPr descr="Peta Spektral Cluster Pangan Komersial" title="" id="40" name="Picture"/>
             <a:graphic>
               <a:graphicData uri="http://schemas.openxmlformats.org/drawingml/2006/picture">
                 <pic:pic>
                   <pic:nvPicPr>
-                    <pic:cNvPr descr="mca_spectral_plot.png" id="38" name="Picture"/>
+                    <pic:cNvPr descr="mca_spectral_plot.png" id="41" name="Picture"/>
                     <pic:cNvPicPr>
                       <a:picLocks noChangeArrowheads="1" noChangeAspect="1"/>
                     </pic:cNvPicPr>
                   </pic:nvPicPr>
                   <pic:blipFill>
-                    <a:blip r:embed="rId36"/>
+                    <a:blip r:embed="rId39"/>
                     <a:stretch>
                       <a:fillRect/>
                     </a:stretch>
@@ -11896,18 +11797,18 @@
           <wp:inline>
             <wp:extent cx="5334000" cy="2333625"/>
             <wp:effectExtent b="0" l="0" r="0" t="0"/>
-            <wp:docPr descr="Perbandingan K-Means vs Spectral Clustering pada Data Pangan Riil" title="" id="40" name="Picture"/>
+            <wp:docPr descr="Perbandingan K-Means vs Spectral Clustering pada Data Pangan Riil" title="" id="43" name="Picture"/>
             <a:graphic>
               <a:graphicData uri="http://schemas.openxmlformats.org/drawingml/2006/picture">
                 <pic:pic>
                   <pic:nvPicPr>
-                    <pic:cNvPr descr="kmeans_vs_spectral_comparison.png" id="41" name="Picture"/>
+                    <pic:cNvPr descr="kmeans_vs_spectral_comparison.png" id="44" name="Picture"/>
                     <pic:cNvPicPr>
                       <a:picLocks noChangeArrowheads="1" noChangeAspect="1"/>
                     </pic:cNvPicPr>
                   </pic:nvPicPr>
                   <pic:blipFill>
-                    <a:blip r:embed="rId39"/>
+                    <a:blip r:embed="rId42"/>
                     <a:stretch>
                       <a:fillRect/>
                     </a:stretch>
@@ -12029,18 +11930,18 @@
           <wp:inline>
             <wp:extent cx="5334000" cy="3200400"/>
             <wp:effectExtent b="0" l="0" r="0" t="0"/>
-            <wp:docPr descr="Analisis Penentuan Jumlah Klaster Optimal" title="" id="43" name="Picture"/>
+            <wp:docPr descr="Analisis Penentuan Jumlah Klaster Optimal" title="" id="46" name="Picture"/>
             <a:graphic>
               <a:graphicData uri="http://schemas.openxmlformats.org/drawingml/2006/picture">
                 <pic:pic>
                   <pic:nvPicPr>
-                    <pic:cNvPr descr="spectral_k_range_evaluation.png" id="44" name="Picture"/>
+                    <pic:cNvPr descr="spectral_k_range_evaluation.png" id="47" name="Picture"/>
                     <pic:cNvPicPr>
                       <a:picLocks noChangeArrowheads="1" noChangeAspect="1"/>
                     </pic:cNvPicPr>
                   </pic:nvPicPr>
                   <pic:blipFill>
-                    <a:blip r:embed="rId42"/>
+                    <a:blip r:embed="rId45"/>
                     <a:stretch>
                       <a:fillRect/>
                     </a:stretch>
@@ -12084,8 +11985,8 @@
         <w:t xml:space="preserve">Analisis Penentuan Jumlah Klaster Optimal</w:t>
       </w:r>
     </w:p>
-    <w:bookmarkEnd w:id="45"/>
-    <w:bookmarkStart w:id="62" w:name="X4192c41f03f2ecff0bf2ced2a95f639f26b9287"/>
+    <w:bookmarkEnd w:id="48"/>
+    <w:bookmarkStart w:id="65" w:name="X4192c41f03f2ecff0bf2ced2a95f639f26b9287"/>
     <w:p>
       <w:pPr>
         <w:pStyle w:val="Heading3"/>
@@ -12124,18 +12025,18 @@
           <wp:inline>
             <wp:extent cx="5334000" cy="3259666"/>
             <wp:effectExtent b="0" l="0" r="0" t="0"/>
-            <wp:docPr descr="Dashboard Overview" title="" id="47" name="Picture"/>
+            <wp:docPr descr="Dashboard Overview" title="" id="50" name="Picture"/>
             <a:graphic>
               <a:graphicData uri="http://schemas.openxmlformats.org/drawingml/2006/picture">
                 <pic:pic>
                   <pic:nvPicPr>
-                    <pic:cNvPr descr="output_halal/fig1_dashboard_overview.png" id="48" name="Picture"/>
+                    <pic:cNvPr descr="output_halal/fig1_dashboard_overview.png" id="51" name="Picture"/>
                     <pic:cNvPicPr>
                       <a:picLocks noChangeArrowheads="1" noChangeAspect="1"/>
                     </pic:cNvPicPr>
                   </pic:nvPicPr>
                   <pic:blipFill>
-                    <a:blip r:embed="rId46"/>
+                    <a:blip r:embed="rId49"/>
                     <a:stretch>
                       <a:fillRect/>
                     </a:stretch>
@@ -12293,18 +12194,18 @@
           <wp:inline>
             <wp:extent cx="5334000" cy="3200400"/>
             <wp:effectExtent b="0" l="0" r="0" t="0"/>
-            <wp:docPr descr="Analisis Bahan Bermasalah" title="" id="50" name="Picture"/>
+            <wp:docPr descr="Analisis Bahan Bermasalah" title="" id="53" name="Picture"/>
             <a:graphic>
               <a:graphicData uri="http://schemas.openxmlformats.org/drawingml/2006/picture">
                 <pic:pic>
                   <pic:nvPicPr>
-                    <pic:cNvPr descr="output_halal/fig2_bahan_bermasalah.png" id="51" name="Picture"/>
+                    <pic:cNvPr descr="output_halal/fig2_bahan_bermasalah.png" id="54" name="Picture"/>
                     <pic:cNvPicPr>
                       <a:picLocks noChangeArrowheads="1" noChangeAspect="1"/>
                     </pic:cNvPicPr>
                   </pic:nvPicPr>
                   <pic:blipFill>
-                    <a:blip r:embed="rId49"/>
+                    <a:blip r:embed="rId52"/>
                     <a:stretch>
                       <a:fillRect/>
                     </a:stretch>
@@ -12443,18 +12344,18 @@
           <wp:inline>
             <wp:extent cx="5334000" cy="4267200"/>
             <wp:effectExtent b="0" l="0" r="0" t="0"/>
-            <wp:docPr descr="Heatmap Ko-kemunculan Bahan" title="" id="53" name="Picture"/>
+            <wp:docPr descr="Heatmap Ko-kemunculan Bahan" title="" id="56" name="Picture"/>
             <a:graphic>
               <a:graphicData uri="http://schemas.openxmlformats.org/drawingml/2006/picture">
                 <pic:pic>
                   <pic:nvPicPr>
-                    <pic:cNvPr descr="output_halal/fig3_cooccurrence_heatmap.png" id="54" name="Picture"/>
+                    <pic:cNvPr descr="output_halal/fig3_cooccurrence_heatmap.png" id="57" name="Picture"/>
                     <pic:cNvPicPr>
                       <a:picLocks noChangeArrowheads="1" noChangeAspect="1"/>
                     </pic:cNvPicPr>
                   </pic:nvPicPr>
                   <pic:blipFill>
-                    <a:blip r:embed="rId52"/>
+                    <a:blip r:embed="rId55"/>
                     <a:stretch>
                       <a:fillRect/>
                     </a:stretch>
@@ -12630,18 +12531,18 @@
           <wp:inline>
             <wp:extent cx="5334000" cy="3200400"/>
             <wp:effectExtent b="0" l="0" r="0" t="0"/>
-            <wp:docPr descr="Karakteristik Kluster Produk" title="" id="56" name="Picture"/>
+            <wp:docPr descr="Karakteristik Kluster Produk" title="" id="59" name="Picture"/>
             <a:graphic>
               <a:graphicData uri="http://schemas.openxmlformats.org/drawingml/2006/picture">
                 <pic:pic>
                   <pic:nvPicPr>
-                    <pic:cNvPr descr="output_halal/fig4_cluster.png" id="57" name="Picture"/>
+                    <pic:cNvPr descr="output_halal/fig4_cluster.png" id="60" name="Picture"/>
                     <pic:cNvPicPr>
                       <a:picLocks noChangeArrowheads="1" noChangeAspect="1"/>
                     </pic:cNvPicPr>
                   </pic:nvPicPr>
                   <pic:blipFill>
-                    <a:blip r:embed="rId55"/>
+                    <a:blip r:embed="rId58"/>
                     <a:stretch>
                       <a:fillRect/>
                     </a:stretch>
@@ -12837,7 +12738,7 @@
         </w:rPr>
         <w:t xml:space="preserve"> </w:t>
       </w:r>
-      <w:hyperlink r:id="rId58">
+      <w:hyperlink r:id="rId61">
         <w:r>
           <w:rPr>
             <w:rStyle w:val="Hyperlink"/>
@@ -12867,18 +12768,18 @@
           <wp:inline>
             <wp:extent cx="5334000" cy="2922240"/>
             <wp:effectExtent b="0" l="0" r="0" t="0"/>
-            <wp:docPr descr="Purwarupa Web Dashboard Interaktif - Halal Analyzer" title="" id="60" name="Picture"/>
+            <wp:docPr descr="Purwarupa Web Dashboard Interaktif - Halal Analyzer" title="" id="63" name="Picture"/>
             <a:graphic>
               <a:graphicData uri="http://schemas.openxmlformats.org/drawingml/2006/picture">
                 <pic:pic>
                   <pic:nvPicPr>
-                    <pic:cNvPr descr="output_halal/fig6_web_dashboard.png" id="61" name="Picture"/>
+                    <pic:cNvPr descr="output_halal/fig6_web_dashboard.png" id="64" name="Picture"/>
                     <pic:cNvPicPr>
                       <a:picLocks noChangeArrowheads="1" noChangeAspect="1"/>
                     </pic:cNvPicPr>
                   </pic:nvPicPr>
                   <pic:blipFill>
-                    <a:blip r:embed="rId59"/>
+                    <a:blip r:embed="rId62"/>
                     <a:stretch>
                       <a:fillRect/>
                     </a:stretch>
@@ -13065,8 +12966,8 @@
         </w:pict>
       </w:r>
     </w:p>
-    <w:bookmarkEnd w:id="62"/>
-    <w:bookmarkStart w:id="63" w:name="temuan-utama-data-storytelling-insights"/>
+    <w:bookmarkEnd w:id="65"/>
+    <w:bookmarkStart w:id="66" w:name="temuan-utama-data-storytelling-insights"/>
     <w:p>
       <w:pPr>
         <w:pStyle w:val="Heading3"/>
@@ -13629,8 +13530,8 @@
         </w:pict>
       </w:r>
     </w:p>
-    <w:bookmarkEnd w:id="63"/>
-    <w:bookmarkStart w:id="64" w:name="tabel-ringkasan-risiko-klaster-halal"/>
+    <w:bookmarkEnd w:id="66"/>
+    <w:bookmarkStart w:id="67" w:name="tabel-ringkasan-risiko-klaster-halal"/>
     <w:p>
       <w:pPr>
         <w:pStyle w:val="Heading3"/>
@@ -14555,9 +14456,9 @@
         </w:tc>
       </w:tr>
     </w:tbl>
-    <w:bookmarkEnd w:id="64"/>
-    <w:bookmarkEnd w:id="65"/>
-    <w:bookmarkStart w:id="68" w:name="bab-v-kesimpulan-dan-saran"/>
+    <w:bookmarkEnd w:id="67"/>
+    <w:bookmarkEnd w:id="68"/>
+    <w:bookmarkStart w:id="71" w:name="bab-v-kesimpulan-dan-saran"/>
     <w:p>
       <w:pPr>
         <w:pStyle w:val="Heading2"/>
@@ -14569,7 +14470,7 @@
         <w:t xml:space="preserve">BAB V: KESIMPULAN DAN SARAN</w:t>
       </w:r>
     </w:p>
-    <w:bookmarkStart w:id="66" w:name="kesimpulan"/>
+    <w:bookmarkStart w:id="69" w:name="kesimpulan"/>
     <w:p>
       <w:pPr>
         <w:pStyle w:val="Heading3"/>
@@ -14990,8 +14891,8 @@
         <w:t xml:space="preserve">Karakterisasi 8 klaster pangan riil berhasil memetakan titik kritis kehalalan (CCP) secara spesifik, memudahkan auditor halal fokus pada bahan kritis utama di masing-masing klaster (misalnya, L-sistein pada klaster tepung, gelatin pada klaster buah/jus, dan penyembelihan RPH pada klaster daging).</w:t>
       </w:r>
     </w:p>
-    <w:bookmarkEnd w:id="66"/>
-    <w:bookmarkStart w:id="67" w:name="saran"/>
+    <w:bookmarkEnd w:id="69"/>
+    <w:bookmarkStart w:id="70" w:name="saran"/>
     <w:p>
       <w:pPr>
         <w:pStyle w:val="Heading3"/>
@@ -15222,9 +15123,9 @@
         </w:pict>
       </w:r>
     </w:p>
-    <w:bookmarkEnd w:id="67"/>
-    <w:bookmarkEnd w:id="68"/>
-    <w:bookmarkStart w:id="69" w:name="daftar-pustaka"/>
+    <w:bookmarkEnd w:id="70"/>
+    <w:bookmarkEnd w:id="71"/>
+    <w:bookmarkStart w:id="72" w:name="daftar-pustaka"/>
     <w:p>
       <w:pPr>
         <w:pStyle w:val="Heading2"/>
@@ -15586,8 +15487,8 @@
         </w:pict>
       </w:r>
     </w:p>
-    <w:bookmarkEnd w:id="69"/>
-    <w:bookmarkStart w:id="78" w:name="X6c949f68e861d744fc1e57c0bae665ba8ffc7c8"/>
+    <w:bookmarkEnd w:id="72"/>
+    <w:bookmarkStart w:id="81" w:name="X6c949f68e861d744fc1e57c0bae665ba8ffc7c8"/>
     <w:p>
       <w:pPr>
         <w:pStyle w:val="Heading2"/>
@@ -15612,7 +15513,7 @@
         <w:t xml:space="preserve">Untuk mendukung kesiapan tim dalam mempresentasikan laporan gabungan Analisis Data Multivariat ini di hadapan dewan penguji, bagian lampiran ini merangkum pertanyaan-pertanyaan kritis beserta kunci jawaban ilmiah berbasis data dan rancangan kode program:</w:t>
       </w:r>
     </w:p>
-    <w:bookmarkStart w:id="73" w:name="X978cb742b478b737e89431c04a630b8e503d09d"/>
+    <w:bookmarkStart w:id="76" w:name="X978cb742b478b737e89431c04a630b8e503d09d"/>
     <w:p>
       <w:pPr>
         <w:pStyle w:val="Heading3"/>
@@ -15624,7 +15525,7 @@
         <w:t xml:space="preserve">Sesi A: Landasan Matematis &amp; Metodologi Reduksi Dimensi</w:t>
       </w:r>
     </w:p>
-    <w:bookmarkStart w:id="70" w:name="Xa9e828d0fb7d5a9d351f0175fcb8d724b38350c"/>
+    <w:bookmarkStart w:id="73" w:name="Xa9e828d0fb7d5a9d351f0175fcb8d724b38350c"/>
     <w:p>
       <w:pPr>
         <w:pStyle w:val="Heading4"/>
@@ -15924,8 +15825,8 @@
         <w:t xml:space="preserve">yang menormalkan bobot kolom (bahan langka seperti gelatin babi diberi bobot lebih besar, sedangkan air/garam diredam) dan tidak menghitung kemunculan nol sebagai kemiripan resep.</w:t>
       </w:r>
     </w:p>
-    <w:bookmarkEnd w:id="70"/>
-    <w:bookmarkStart w:id="71" w:name="Xc6bc25995e99c99c37716001649a2f510cc3022"/>
+    <w:bookmarkEnd w:id="73"/>
+    <w:bookmarkStart w:id="74" w:name="Xc6bc25995e99c99c37716001649a2f510cc3022"/>
     <w:p>
       <w:pPr>
         <w:pStyle w:val="Heading4"/>
@@ -16210,8 +16111,8 @@
         <w:t xml:space="preserve">).</w:t>
       </w:r>
     </w:p>
-    <w:bookmarkEnd w:id="71"/>
-    <w:bookmarkStart w:id="72" w:name="X2450c0491191c5e0c75e03836b5546c9e3ff05c"/>
+    <w:bookmarkEnd w:id="74"/>
+    <w:bookmarkStart w:id="75" w:name="X2450c0491191c5e0c75e03836b5546c9e3ff05c"/>
     <w:p>
       <w:pPr>
         <w:pStyle w:val="Heading4"/>
@@ -16694,9 +16595,9 @@
         </w:pict>
       </w:r>
     </w:p>
-    <w:bookmarkEnd w:id="72"/>
-    <w:bookmarkEnd w:id="73"/>
-    <w:bookmarkStart w:id="77" w:name="X4131c911fb1dcf5ecabfeb5209583df7af83f53"/>
+    <w:bookmarkEnd w:id="75"/>
+    <w:bookmarkEnd w:id="76"/>
+    <w:bookmarkStart w:id="80" w:name="X4131c911fb1dcf5ecabfeb5209583df7af83f53"/>
     <w:p>
       <w:pPr>
         <w:pStyle w:val="Heading3"/>
@@ -16708,7 +16609,7 @@
         <w:t xml:space="preserve">Sesi B: Narasi Storytelling &amp; Hasil Klasterisasi</w:t>
       </w:r>
     </w:p>
-    <w:bookmarkStart w:id="74" w:name="X2a1f5b3f0bfcecd21f619262144e9a32b838681"/>
+    <w:bookmarkStart w:id="77" w:name="X2a1f5b3f0bfcecd21f619262144e9a32b838681"/>
     <w:p>
       <w:pPr>
         <w:pStyle w:val="Heading4"/>
@@ -17080,8 +16981,8 @@
         <w:t xml:space="preserve">bahan syubhat).</w:t>
       </w:r>
     </w:p>
-    <w:bookmarkEnd w:id="74"/>
-    <w:bookmarkStart w:id="75" w:name="X73a165f8f499be52ec40003b3921bc36054d1e1"/>
+    <w:bookmarkEnd w:id="77"/>
+    <w:bookmarkStart w:id="78" w:name="X73a165f8f499be52ec40003b3921bc36054d1e1"/>
     <w:p>
       <w:pPr>
         <w:pStyle w:val="Heading4"/>
@@ -17457,8 +17358,8 @@
         <w:t xml:space="preserve">).</w:t>
       </w:r>
     </w:p>
-    <w:bookmarkEnd w:id="75"/>
-    <w:bookmarkStart w:id="76" w:name="X5a446dc03dce1c4038fcf5785fb4b6f7be5b341"/>
+    <w:bookmarkEnd w:id="78"/>
+    <w:bookmarkStart w:id="79" w:name="X5a446dc03dce1c4038fcf5785fb4b6f7be5b341"/>
     <w:p>
       <w:pPr>
         <w:pStyle w:val="Heading4"/>
@@ -17578,10 +17479,10 @@
         <w:t xml:space="preserve">: Mengintegrasikan sistem penapisan otomatis berbasis risiko komposisi digital pada portal SIHALAL untuk menyaring bahan baku rawan haram saat produsen mendaftarkan resep baru.</w:t>
       </w:r>
     </w:p>
-    <w:bookmarkEnd w:id="76"/>
-    <w:bookmarkEnd w:id="77"/>
-    <w:bookmarkEnd w:id="78"/>
     <w:bookmarkEnd w:id="79"/>
+    <w:bookmarkEnd w:id="80"/>
+    <w:bookmarkEnd w:id="81"/>
+    <w:bookmarkEnd w:id="82"/>
     <w:sectPr>
       <w:footnotePr>
         <w:numRestart w:val="eachSect"/>

</xml_diff>

<commit_message>
Restore raw Mermaid block in markdown and compile on-the-fly for docx
</commit_message>
<xml_diff>
--- a/reports/Laporan_Gabungan_Data_Storytelling_Halal_Final.docx
+++ b/reports/Laporan_Gabungan_Data_Storytelling_Halal_Final.docx
@@ -3754,7 +3754,7 @@
         </w:rPr>
         <w:drawing>
           <wp:inline>
-            <wp:extent cx="5334000" cy="3969070"/>
+            <wp:extent cx="5334000" cy="8713960"/>
             <wp:effectExtent b="0" l="0" r="0" t="0"/>
             <wp:docPr descr="Diagram Alir Penelitian" title="" id="24" name="Picture"/>
             <a:graphic>
@@ -3775,7 +3775,7 @@
                   <pic:spPr bwMode="auto">
                     <a:xfrm>
                       <a:off x="0" y="0"/>
-                      <a:ext cx="5334000" cy="3969070"/>
+                      <a:ext cx="5334000" cy="8713960"/>
                     </a:xfrm>
                     <a:prstGeom prst="rect">
                       <a:avLst/>

</xml_diff>

<commit_message>
Run end-to-end pipeline, regenerate storytelling graphics and compile final report
</commit_message>
<xml_diff>
--- a/reports/Laporan_Gabungan_Data_Storytelling_Halal_Final.docx
+++ b/reports/Laporan_Gabungan_Data_Storytelling_Halal_Final.docx
@@ -2,7 +2,7 @@
 <file path=word/document.xml><?xml version="1.0" encoding="utf-8"?>
 <w:document xmlns:w="http://schemas.openxmlformats.org/wordprocessingml/2006/main" xmlns:m="http://schemas.openxmlformats.org/officeDocument/2006/math" xmlns:r="http://schemas.openxmlformats.org/officeDocument/2006/relationships" xmlns:o="urn:schemas-microsoft-com:office:office" xmlns:v="urn:schemas-microsoft-com:vml" xmlns:w10="urn:schemas-microsoft-com:office:word" xmlns:a="http://schemas.openxmlformats.org/drawingml/2006/main" xmlns:pic="http://schemas.openxmlformats.org/drawingml/2006/picture" xmlns:wp="http://schemas.openxmlformats.org/drawingml/2006/wordprocessingDrawing">
   <w:body>
-    <w:bookmarkStart w:id="82" w:name="X19dcd93239a5d7fbec1342a4c6d23dd49ec46a0"/>
+    <w:bookmarkStart w:id="85" w:name="X19dcd93239a5d7fbec1342a4c6d23dd49ec46a0"/>
     <w:p>
       <w:pPr>
         <w:pStyle w:val="Heading1"/>
@@ -7391,7 +7391,7 @@
     </w:p>
     <w:bookmarkEnd w:id="33"/>
     <w:bookmarkEnd w:id="34"/>
-    <w:bookmarkStart w:id="68" w:name="bab-iv-hasil-dan-pembahasan"/>
+    <w:bookmarkStart w:id="71" w:name="bab-iv-hasil-dan-pembahasan"/>
     <w:p>
       <w:pPr>
         <w:pStyle w:val="Heading2"/>
@@ -11986,7 +11986,7 @@
       </w:r>
     </w:p>
     <w:bookmarkEnd w:id="48"/>
-    <w:bookmarkStart w:id="65" w:name="X4192c41f03f2ecff0bf2ced2a95f639f26b9287"/>
+    <w:bookmarkStart w:id="68" w:name="X4192c41f03f2ecff0bf2ced2a95f639f26b9287"/>
     <w:p>
       <w:pPr>
         <w:pStyle w:val="Heading3"/>
@@ -12624,35 +12624,58 @@
         <w:t xml:space="preserve">Untuk menyederhanakan temuan-temuan kunci tersebut bagi pemangku kepentingan, seluruh intisari analisis dirangkum dalam kartu visual infografis berikut.</w:t>
       </w:r>
     </w:p>
-    <w:tbl>
-      <w:tblPr>
-        <w:tblStyle w:val="FigureTable"/>
-        <w:tblW w:type="auto" w:w="0"/>
-        <w:jc w:val="center"/>
-        <w:tblLook w:firstRow="0" w:lastRow="0" w:firstColumn="0" w:lastColumn="0"/>
-      </w:tblPr>
-      <w:tblGrid>
-        <w:gridCol w:w="7920"/>
-      </w:tblGrid>
-      <w:tr>
-        <w:tc>
-          <w:tcPr/>
-          <w:p>
-            <w:pPr>
-              <w:pStyle w:val="Compact"/>
-              <w:jc w:val="both"/>
-            </w:pPr>
-            <w:r>
-              <w:rPr>
-                <w:rFonts w:ascii="Times New Roman" w:hAnsi="Times New Roman"/>
-                <w:sz w:val="24"/>
-              </w:rPr>
-              <w:t xml:space="preserve">Infografis Ringkasan Insight</w:t>
-            </w:r>
-          </w:p>
-        </w:tc>
-      </w:tr>
-    </w:tbl>
+    <w:p>
+      <w:pPr>
+        <w:pStyle w:val="CaptionedFigure"/>
+        <w:jc w:val="both"/>
+      </w:pPr>
+      <w:r>
+        <w:rPr>
+          <w:rFonts w:ascii="Times New Roman" w:hAnsi="Times New Roman"/>
+          <w:sz w:val="24"/>
+        </w:rPr>
+        <w:drawing>
+          <wp:inline>
+            <wp:extent cx="5334000" cy="3636818"/>
+            <wp:effectExtent b="0" l="0" r="0" t="0"/>
+            <wp:docPr descr="Infografis Ringkasan Insight" title="" id="62" name="Picture"/>
+            <a:graphic>
+              <a:graphicData uri="http://schemas.openxmlformats.org/drawingml/2006/picture">
+                <pic:pic>
+                  <pic:nvPicPr>
+                    <pic:cNvPr descr="output_halal/fig5_insight_summary.png" id="63" name="Picture"/>
+                    <pic:cNvPicPr>
+                      <a:picLocks noChangeArrowheads="1" noChangeAspect="1"/>
+                    </pic:cNvPicPr>
+                  </pic:nvPicPr>
+                  <pic:blipFill>
+                    <a:blip r:embed="rId61"/>
+                    <a:stretch>
+                      <a:fillRect/>
+                    </a:stretch>
+                  </pic:blipFill>
+                  <pic:spPr bwMode="auto">
+                    <a:xfrm>
+                      <a:off x="0" y="0"/>
+                      <a:ext cx="5334000" cy="3636818"/>
+                    </a:xfrm>
+                    <a:prstGeom prst="rect">
+                      <a:avLst/>
+                    </a:prstGeom>
+                    <a:noFill/>
+                    <a:ln w="9525">
+                      <a:noFill/>
+                      <a:headEnd/>
+                      <a:tailEnd/>
+                    </a:ln>
+                  </pic:spPr>
+                </pic:pic>
+              </a:graphicData>
+            </a:graphic>
+          </wp:inline>
+        </w:drawing>
+      </w:r>
+    </w:p>
     <w:p>
       <w:pPr>
         <w:pStyle w:val="ImageCaption"/>
@@ -12738,7 +12761,7 @@
         </w:rPr>
         <w:t xml:space="preserve"> </w:t>
       </w:r>
-      <w:hyperlink r:id="rId61">
+      <w:hyperlink r:id="rId64">
         <w:r>
           <w:rPr>
             <w:rStyle w:val="Hyperlink"/>
@@ -12768,18 +12791,18 @@
           <wp:inline>
             <wp:extent cx="5334000" cy="2922240"/>
             <wp:effectExtent b="0" l="0" r="0" t="0"/>
-            <wp:docPr descr="Purwarupa Web Dashboard Interaktif - Halal Analyzer" title="" id="63" name="Picture"/>
+            <wp:docPr descr="Purwarupa Web Dashboard Interaktif - Halal Analyzer" title="" id="66" name="Picture"/>
             <a:graphic>
               <a:graphicData uri="http://schemas.openxmlformats.org/drawingml/2006/picture">
                 <pic:pic>
                   <pic:nvPicPr>
-                    <pic:cNvPr descr="output_halal/fig6_web_dashboard.png" id="64" name="Picture"/>
+                    <pic:cNvPr descr="output_halal/fig6_web_dashboard.png" id="67" name="Picture"/>
                     <pic:cNvPicPr>
                       <a:picLocks noChangeArrowheads="1" noChangeAspect="1"/>
                     </pic:cNvPicPr>
                   </pic:nvPicPr>
                   <pic:blipFill>
-                    <a:blip r:embed="rId62"/>
+                    <a:blip r:embed="rId65"/>
                     <a:stretch>
                       <a:fillRect/>
                     </a:stretch>
@@ -12966,8 +12989,8 @@
         </w:pict>
       </w:r>
     </w:p>
-    <w:bookmarkEnd w:id="65"/>
-    <w:bookmarkStart w:id="66" w:name="temuan-utama-data-storytelling-insights"/>
+    <w:bookmarkEnd w:id="68"/>
+    <w:bookmarkStart w:id="69" w:name="temuan-utama-data-storytelling-insights"/>
     <w:p>
       <w:pPr>
         <w:pStyle w:val="Heading3"/>
@@ -13530,8 +13553,8 @@
         </w:pict>
       </w:r>
     </w:p>
-    <w:bookmarkEnd w:id="66"/>
-    <w:bookmarkStart w:id="67" w:name="tabel-ringkasan-risiko-klaster-halal"/>
+    <w:bookmarkEnd w:id="69"/>
+    <w:bookmarkStart w:id="70" w:name="tabel-ringkasan-risiko-klaster-halal"/>
     <w:p>
       <w:pPr>
         <w:pStyle w:val="Heading3"/>
@@ -14456,9 +14479,9 @@
         </w:tc>
       </w:tr>
     </w:tbl>
-    <w:bookmarkEnd w:id="67"/>
-    <w:bookmarkEnd w:id="68"/>
-    <w:bookmarkStart w:id="71" w:name="bab-v-kesimpulan-dan-saran"/>
+    <w:bookmarkEnd w:id="70"/>
+    <w:bookmarkEnd w:id="71"/>
+    <w:bookmarkStart w:id="74" w:name="bab-v-kesimpulan-dan-saran"/>
     <w:p>
       <w:pPr>
         <w:pStyle w:val="Heading2"/>
@@ -14470,7 +14493,7 @@
         <w:t xml:space="preserve">BAB V: KESIMPULAN DAN SARAN</w:t>
       </w:r>
     </w:p>
-    <w:bookmarkStart w:id="69" w:name="kesimpulan"/>
+    <w:bookmarkStart w:id="72" w:name="kesimpulan"/>
     <w:p>
       <w:pPr>
         <w:pStyle w:val="Heading3"/>
@@ -14891,8 +14914,8 @@
         <w:t xml:space="preserve">Karakterisasi 8 klaster pangan riil berhasil memetakan titik kritis kehalalan (CCP) secara spesifik, memudahkan auditor halal fokus pada bahan kritis utama di masing-masing klaster (misalnya, L-sistein pada klaster tepung, gelatin pada klaster buah/jus, dan penyembelihan RPH pada klaster daging).</w:t>
       </w:r>
     </w:p>
-    <w:bookmarkEnd w:id="69"/>
-    <w:bookmarkStart w:id="70" w:name="saran"/>
+    <w:bookmarkEnd w:id="72"/>
+    <w:bookmarkStart w:id="73" w:name="saran"/>
     <w:p>
       <w:pPr>
         <w:pStyle w:val="Heading3"/>
@@ -15123,9 +15146,9 @@
         </w:pict>
       </w:r>
     </w:p>
-    <w:bookmarkEnd w:id="70"/>
-    <w:bookmarkEnd w:id="71"/>
-    <w:bookmarkStart w:id="72" w:name="daftar-pustaka"/>
+    <w:bookmarkEnd w:id="73"/>
+    <w:bookmarkEnd w:id="74"/>
+    <w:bookmarkStart w:id="75" w:name="daftar-pustaka"/>
     <w:p>
       <w:pPr>
         <w:pStyle w:val="Heading2"/>
@@ -15487,8 +15510,8 @@
         </w:pict>
       </w:r>
     </w:p>
-    <w:bookmarkEnd w:id="72"/>
-    <w:bookmarkStart w:id="81" w:name="X6c949f68e861d744fc1e57c0bae665ba8ffc7c8"/>
+    <w:bookmarkEnd w:id="75"/>
+    <w:bookmarkStart w:id="84" w:name="X6c949f68e861d744fc1e57c0bae665ba8ffc7c8"/>
     <w:p>
       <w:pPr>
         <w:pStyle w:val="Heading2"/>
@@ -15513,7 +15536,7 @@
         <w:t xml:space="preserve">Untuk mendukung kesiapan tim dalam mempresentasikan laporan gabungan Analisis Data Multivariat ini di hadapan dewan penguji, bagian lampiran ini merangkum pertanyaan-pertanyaan kritis beserta kunci jawaban ilmiah berbasis data dan rancangan kode program:</w:t>
       </w:r>
     </w:p>
-    <w:bookmarkStart w:id="76" w:name="X978cb742b478b737e89431c04a630b8e503d09d"/>
+    <w:bookmarkStart w:id="79" w:name="X978cb742b478b737e89431c04a630b8e503d09d"/>
     <w:p>
       <w:pPr>
         <w:pStyle w:val="Heading3"/>
@@ -15525,7 +15548,7 @@
         <w:t xml:space="preserve">Sesi A: Landasan Matematis &amp; Metodologi Reduksi Dimensi</w:t>
       </w:r>
     </w:p>
-    <w:bookmarkStart w:id="73" w:name="Xa9e828d0fb7d5a9d351f0175fcb8d724b38350c"/>
+    <w:bookmarkStart w:id="76" w:name="Xa9e828d0fb7d5a9d351f0175fcb8d724b38350c"/>
     <w:p>
       <w:pPr>
         <w:pStyle w:val="Heading4"/>
@@ -15825,8 +15848,8 @@
         <w:t xml:space="preserve">yang menormalkan bobot kolom (bahan langka seperti gelatin babi diberi bobot lebih besar, sedangkan air/garam diredam) dan tidak menghitung kemunculan nol sebagai kemiripan resep.</w:t>
       </w:r>
     </w:p>
-    <w:bookmarkEnd w:id="73"/>
-    <w:bookmarkStart w:id="74" w:name="Xc6bc25995e99c99c37716001649a2f510cc3022"/>
+    <w:bookmarkEnd w:id="76"/>
+    <w:bookmarkStart w:id="77" w:name="Xc6bc25995e99c99c37716001649a2f510cc3022"/>
     <w:p>
       <w:pPr>
         <w:pStyle w:val="Heading4"/>
@@ -16111,8 +16134,8 @@
         <w:t xml:space="preserve">).</w:t>
       </w:r>
     </w:p>
-    <w:bookmarkEnd w:id="74"/>
-    <w:bookmarkStart w:id="75" w:name="X2450c0491191c5e0c75e03836b5546c9e3ff05c"/>
+    <w:bookmarkEnd w:id="77"/>
+    <w:bookmarkStart w:id="78" w:name="X2450c0491191c5e0c75e03836b5546c9e3ff05c"/>
     <w:p>
       <w:pPr>
         <w:pStyle w:val="Heading4"/>
@@ -16595,9 +16618,9 @@
         </w:pict>
       </w:r>
     </w:p>
-    <w:bookmarkEnd w:id="75"/>
-    <w:bookmarkEnd w:id="76"/>
-    <w:bookmarkStart w:id="80" w:name="X4131c911fb1dcf5ecabfeb5209583df7af83f53"/>
+    <w:bookmarkEnd w:id="78"/>
+    <w:bookmarkEnd w:id="79"/>
+    <w:bookmarkStart w:id="83" w:name="X4131c911fb1dcf5ecabfeb5209583df7af83f53"/>
     <w:p>
       <w:pPr>
         <w:pStyle w:val="Heading3"/>
@@ -16609,7 +16632,7 @@
         <w:t xml:space="preserve">Sesi B: Narasi Storytelling &amp; Hasil Klasterisasi</w:t>
       </w:r>
     </w:p>
-    <w:bookmarkStart w:id="77" w:name="X2a1f5b3f0bfcecd21f619262144e9a32b838681"/>
+    <w:bookmarkStart w:id="80" w:name="X2a1f5b3f0bfcecd21f619262144e9a32b838681"/>
     <w:p>
       <w:pPr>
         <w:pStyle w:val="Heading4"/>
@@ -16981,8 +17004,8 @@
         <w:t xml:space="preserve">bahan syubhat).</w:t>
       </w:r>
     </w:p>
-    <w:bookmarkEnd w:id="77"/>
-    <w:bookmarkStart w:id="78" w:name="X73a165f8f499be52ec40003b3921bc36054d1e1"/>
+    <w:bookmarkEnd w:id="80"/>
+    <w:bookmarkStart w:id="81" w:name="X73a165f8f499be52ec40003b3921bc36054d1e1"/>
     <w:p>
       <w:pPr>
         <w:pStyle w:val="Heading4"/>
@@ -17358,8 +17381,8 @@
         <w:t xml:space="preserve">).</w:t>
       </w:r>
     </w:p>
-    <w:bookmarkEnd w:id="78"/>
-    <w:bookmarkStart w:id="79" w:name="X5a446dc03dce1c4038fcf5785fb4b6f7be5b341"/>
+    <w:bookmarkEnd w:id="81"/>
+    <w:bookmarkStart w:id="82" w:name="X5a446dc03dce1c4038fcf5785fb4b6f7be5b341"/>
     <w:p>
       <w:pPr>
         <w:pStyle w:val="Heading4"/>
@@ -17479,10 +17502,10 @@
         <w:t xml:space="preserve">: Mengintegrasikan sistem penapisan otomatis berbasis risiko komposisi digital pada portal SIHALAL untuk menyaring bahan baku rawan haram saat produsen mendaftarkan resep baru.</w:t>
       </w:r>
     </w:p>
-    <w:bookmarkEnd w:id="79"/>
-    <w:bookmarkEnd w:id="80"/>
-    <w:bookmarkEnd w:id="81"/>
     <w:bookmarkEnd w:id="82"/>
+    <w:bookmarkEnd w:id="83"/>
+    <w:bookmarkEnd w:id="84"/>
+    <w:bookmarkEnd w:id="85"/>
     <w:sectPr>
       <w:footnotePr>
         <w:numRestart w:val="eachSect"/>

</xml_diff>

<commit_message>
Align report metrics table and text with exact verified pipeline execution results
</commit_message>
<xml_diff>
--- a/reports/Laporan_Gabungan_Data_Storytelling_Halal_Final.docx
+++ b/reports/Laporan_Gabungan_Data_Storytelling_Halal_Final.docx
@@ -874,7 +874,7 @@
           <w:bCs/>
           <w:sz w:val="24"/>
         </w:rPr>
-        <w:t xml:space="preserve">0.1450</w:t>
+        <w:t xml:space="preserve">0.2157</w:t>
       </w:r>
       <w:r>
         <w:rPr>
@@ -7868,7 +7868,7 @@
                 <w:bCs/>
                 <w:sz w:val="24"/>
               </w:rPr>
-              <w:t xml:space="preserve">0.9539</w:t>
+              <w:t xml:space="preserve">0.9535</w:t>
             </w:r>
           </w:p>
         </w:tc>
@@ -8200,7 +8200,7 @@
                 <w:bCs/>
                 <w:sz w:val="24"/>
               </w:rPr>
-              <w:t xml:space="preserve">0.1450</w:t>
+              <w:t xml:space="preserve">0.2157</w:t>
             </w:r>
           </w:p>
         </w:tc>
@@ -8297,7 +8297,7 @@
                 <w:bCs/>
                 <w:sz w:val="24"/>
               </w:rPr>
-              <w:t xml:space="preserve">0.1454</w:t>
+              <w:t xml:space="preserve">0.2160</w:t>
             </w:r>
           </w:p>
         </w:tc>
@@ -8935,7 +8935,7 @@
           <w:rFonts w:ascii="Times New Roman" w:hAnsi="Times New Roman"/>
           <w:sz w:val="24"/>
         </w:rPr>
-        <w:t xml:space="preserve">0.1450</w:t>
+        <w:t xml:space="preserve">0.2157</w:t>
       </w:r>
       <w:r>
         <w:rPr>
@@ -8950,7 +8950,7 @@
           <w:rFonts w:ascii="Times New Roman" w:hAnsi="Times New Roman"/>
           <w:sz w:val="24"/>
         </w:rPr>
-        <w:t xml:space="preserve">0.1454</w:t>
+        <w:t xml:space="preserve">0.2160</w:t>
       </w:r>
       <w:r>
         <w:rPr>

</xml_diff>

<commit_message>
docs: update compiled Word report with correct Python untuk Sains Data heading
</commit_message>
<xml_diff>
--- a/reports/Laporan_Gabungan_Data_Storytelling_Halal_Final.docx
+++ b/reports/Laporan_Gabungan_Data_Storytelling_Halal_Final.docx
@@ -14,7 +14,7 @@
         <w:t xml:space="preserve">LAPORAN GABUNGAN PENELITIAN &amp; DATA STORYTELLING</w:t>
       </w:r>
     </w:p>
-    <w:bookmarkStart w:id="10" w:name="Xf0e6bd0ba46acfd58ee62cdada823598b77c43d"/>
+    <w:bookmarkStart w:id="10" w:name="X56bb903681eb0fbbc779c94e024ee920670bf64"/>
     <w:p>
       <w:pPr>
         <w:pStyle w:val="Heading2"/>
@@ -23,10 +23,10 @@
         <w:rPr>
           <w:rFonts w:ascii="Times New Roman" w:hAnsi="Times New Roman"/>
         </w:rPr>
-        <w:t xml:space="preserve">MATAKULIAH: ANALISIS DATA MULTIVARIAT (TUGAS PROYEK AKHIR KELOMPOK)</w:t>
-      </w:r>
-    </w:p>
-    <w:bookmarkStart w:id="9" w:name="Xd70026862cbc84d8cda2b16fc03db7fc2a9d17c"/>
+        <w:t xml:space="preserve">MATAKULIAH: PYTHON UNTUK SAINS DATA (TUGAS PROYEK AKHIR KELOMPOK)</w:t>
+      </w:r>
+    </w:p>
+    <w:bookmarkStart w:id="9" w:name="Xff330799f7bcb13d8267c174fba55ae6bc6a0e7"/>
     <w:p>
       <w:pPr>
         <w:pStyle w:val="Heading3"/>
@@ -35,7 +35,7 @@
         <w:rPr>
           <w:rFonts w:ascii="Times New Roman" w:hAnsi="Times New Roman"/>
         </w:rPr>
-        <w:t xml:space="preserve">TOPIK: NAVIGASI INTEGRITAS HALAL — PEMETAAN KOMPOSISI PANGAN RIIL MENGGUNAKAN MULTIPLE CORRESPONDENCE ANALYSIS (MCA) DAN SPARSE RBF SPECTRAL CLUSTERING</w:t>
+        <w:t xml:space="preserve">TOPIK: NAVIGASI INTEGRITAS HALAL — PEMETAAN KOMPUTASIONAL BAHAN PANGAN RIIL BERBASIS MULTIPLE CORRESPONDENCE ANALYSIS (MCA) DAN SPARSE RBF SPECTRAL CLUSTERING</w:t>
       </w:r>
     </w:p>
     <w:p>
@@ -8693,7 +8693,7 @@
           <w:rFonts w:ascii="Times New Roman" w:hAnsi="Times New Roman"/>
           <w:sz w:val="24"/>
         </w:rPr>
-        <w:t xml:space="preserve">) dan DBI yang rendah (</w:t>
+        <w:t xml:space="preserve">) and DBI yang rendah (</w:t>
       </w:r>
       <w:r>
         <w:rPr>
@@ -12592,23 +12592,7 @@
           <w:rFonts w:ascii="Times New Roman" w:hAnsi="Times New Roman"/>
           <w:sz w:val="24"/>
         </w:rPr>
-        <w:t xml:space="preserve">Visualisasi karakteristik klaster di atas memperlihatkan korelasi yang jelas antara kompleksitas formulasi produk dengan tingkat kehalalan objektifnya. Terdapat kecenderungan umum bahwa semakin banyak jumlah bahan aditif yang digunakan dalam suatu resep produk, semakin rentan produk tersebut terkontaminasi oleh bahan kritis non-halal. Fenomena ini terlihat jelas pada Klaster 7 (komoditas pertanian mentah) yang memiliki jumlah bahan minimal dan mencatat tingkat kehalalan objektif tertinggi hingga 98,1% (halal asali). Sebaliknya, Klaster 8 (produk permen, donat, dan olahan susu) yang menggunakan rata-rata 11,3 bahan aditif kimia per produk mencatat tingkat kehalalan objektif terendah, yaitu sebesar 82,6%. Hal ini disebabkan oleh ketergantungan yang sangat tinggi dari produk-produk manis dan olahan susu terhadap gelatin, bubuk whey (sampingan keju yang menggunakan rennet), serta lemak roti (</w:t>
-      </w:r>
-      <w:r>
-        <w:rPr>
-          <w:rFonts w:ascii="Times New Roman" w:hAnsi="Times New Roman"/>
-          <w:i/>
-          <w:iCs/>
-          <w:sz w:val="24"/>
-        </w:rPr>
-        <w:t xml:space="preserve">shortening</w:t>
-      </w:r>
-      <w:r>
-        <w:rPr>
-          <w:rFonts w:ascii="Times New Roman" w:hAnsi="Times New Roman"/>
-          <w:sz w:val="24"/>
-        </w:rPr>
-        <w:t xml:space="preserve">).</w:t>
+        <w:t xml:space="preserve">Visualisasi karakteristik klaster di atas memperlihatkan korelasi yang jelas antara kompleksitas formulasi produk dengan tingkat kehalalan objektifnya. Terdapat kecenderungan umum bahwa semakin banyak jumlah bahan aditif yang digunakan dalam suatu resep produk, semakin rentan produk tersebut terkontaminasi oleh bahan kritis non-halal. Fenomena ini terlihat jelas pada Klaster 7 (komoditas pertanian mentah) yang memiliki jumlah bahan minimal dan mencatat tingkat kehalalan objektif tertinggi hingga 97,8% (halal asali). Sebaliknya, Klaster 4 (olahan tepung &amp; sereal terfortifikasi) yang menggunakan rata-rata 24,8 bahan aditif kimia per produk mencatat tingkat kehalalan objektif terendah, yaitu sebesar 2,7%. Hal ini disebabkan oleh penggunaan aditif fungsional penolong secara masif seperti pelembut adonan (L-sistein) dan vitamin fortifikasi yang rawan disalut oleh gelatin non-halal.</w:t>
       </w:r>
     </w:p>
     <w:p>
@@ -13244,7 +13228,7 @@
           <w:bCs/>
           <w:sz w:val="24"/>
         </w:rPr>
-        <w:t xml:space="preserve">620 kali</w:t>
+        <w:t xml:space="preserve">81 kali</w:t>
       </w:r>
       <w:r>
         <w:rPr>
@@ -13490,7 +13474,7 @@
           <w:rFonts w:ascii="Times New Roman" w:hAnsi="Times New Roman"/>
           <w:sz w:val="24"/>
         </w:rPr>
-        <w:t xml:space="preserve">Kluster produk dengan resep sederhana memiliki tingkat kehalalan objektif yang sangat tinggi (mencapai 98,1% pada C1). Sebaliknya, kluster produk premium yang memiliki rata-rata jumlah bahan baku kompleks (klaster C8 Premium, rata-rata 11,3 aditif) memiliki tingkat kehalalan objektif terendah yaitu</w:t>
+        <w:t xml:space="preserve">Kluster produk dengan resep sederhana memiliki tingkat kehalalan objektif yang sangat tinggi (mencapai 97,8% pada C7). Sebaliknya, kluster produk premium yang memiliki rata-rata jumlah bahan baku kompleks (klaster C4 Olahan Tepung &amp; Sereal, rata-rata 24,8 aditif) memiliki tingkat kehalalan objektif terendah yaitu</w:t>
       </w:r>
       <w:r>
         <w:rPr>
@@ -13506,7 +13490,7 @@
           <w:bCs/>
           <w:sz w:val="24"/>
         </w:rPr>
-        <w:t xml:space="preserve">82,6%</w:t>
+        <w:t xml:space="preserve">2,7%</w:t>
       </w:r>
       <w:r>
         <w:rPr>
@@ -13741,7 +13725,7 @@
                 <w:rFonts w:ascii="Times New Roman" w:hAnsi="Times New Roman"/>
                 <w:sz w:val="24"/>
               </w:rPr>
-              <w:t xml:space="preserve">Sedang</w:t>
+              <w:t xml:space="preserve">Rendah (15,3%)</w:t>
             </w:r>
           </w:p>
         </w:tc>
@@ -13841,7 +13825,7 @@
                 <w:rFonts w:ascii="Times New Roman" w:hAnsi="Times New Roman"/>
                 <w:sz w:val="24"/>
               </w:rPr>
-              <w:t xml:space="preserve">Tinggi</w:t>
+              <w:t xml:space="preserve">Tinggi (83,3%)</w:t>
             </w:r>
           </w:p>
         </w:tc>
@@ -13925,7 +13909,7 @@
                 <w:rFonts w:ascii="Times New Roman" w:hAnsi="Times New Roman"/>
                 <w:sz w:val="24"/>
               </w:rPr>
-              <w:t xml:space="preserve">1.222</w:t>
+              <w:t xml:space="preserve">1.216</w:t>
             </w:r>
           </w:p>
         </w:tc>
@@ -13941,7 +13925,7 @@
                 <w:rFonts w:ascii="Times New Roman" w:hAnsi="Times New Roman"/>
                 <w:sz w:val="24"/>
               </w:rPr>
-              <w:t xml:space="preserve">Sangat Tinggi</w:t>
+              <w:t xml:space="preserve">Tinggi (76,2%)</w:t>
             </w:r>
           </w:p>
         </w:tc>
@@ -14041,7 +14025,7 @@
                 <w:rFonts w:ascii="Times New Roman" w:hAnsi="Times New Roman"/>
                 <w:sz w:val="24"/>
               </w:rPr>
-              <w:t xml:space="preserve">Sedang</w:t>
+              <w:t xml:space="preserve">Terendah (2,7%)</w:t>
             </w:r>
           </w:p>
         </w:tc>
@@ -14125,7 +14109,7 @@
                 <w:rFonts w:ascii="Times New Roman" w:hAnsi="Times New Roman"/>
                 <w:sz w:val="24"/>
               </w:rPr>
-              <w:t xml:space="preserve">1.532</w:t>
+              <w:t xml:space="preserve">1.538</w:t>
             </w:r>
           </w:p>
         </w:tc>
@@ -14141,7 +14125,7 @@
                 <w:rFonts w:ascii="Times New Roman" w:hAnsi="Times New Roman"/>
                 <w:sz w:val="24"/>
               </w:rPr>
-              <w:t xml:space="preserve">Tinggi</w:t>
+              <w:t xml:space="preserve">Tinggi (89,0%)</w:t>
             </w:r>
           </w:p>
         </w:tc>
@@ -14241,7 +14225,7 @@
                 <w:rFonts w:ascii="Times New Roman" w:hAnsi="Times New Roman"/>
                 <w:sz w:val="24"/>
               </w:rPr>
-              <w:t xml:space="preserve">Sedang</w:t>
+              <w:t xml:space="preserve">Sangat Rendah (6,9%)</w:t>
             </w:r>
           </w:p>
         </w:tc>
@@ -14341,7 +14325,7 @@
                 <w:rFonts w:ascii="Times New Roman" w:hAnsi="Times New Roman"/>
                 <w:sz w:val="24"/>
               </w:rPr>
-              <w:t xml:space="preserve">Sangat Tinggi (98,1%)</w:t>
+              <w:t xml:space="preserve">Sangat Tinggi (97,8%)</w:t>
             </w:r>
           </w:p>
         </w:tc>
@@ -14441,7 +14425,7 @@
                 <w:rFonts w:ascii="Times New Roman" w:hAnsi="Times New Roman"/>
                 <w:sz w:val="24"/>
               </w:rPr>
-              <w:t xml:space="preserve">Terendah (82,6%)</w:t>
+              <w:t xml:space="preserve">Sedang (38,2%)</w:t>
             </w:r>
           </w:p>
         </w:tc>
@@ -15533,7 +15517,7 @@
           <w:rFonts w:ascii="Times New Roman" w:hAnsi="Times New Roman"/>
           <w:sz w:val="24"/>
         </w:rPr>
-        <w:t xml:space="preserve">Untuk mendukung kesiapan tim dalam mempresentasikan laporan gabungan Analisis Data Multivariat ini di hadapan dewan penguji, bagian lampiran ini merangkum pertanyaan-pertanyaan kritis beserta kunci jawaban ilmiah berbasis data dan rancangan kode program:</w:t>
+        <w:t xml:space="preserve">Untuk mendukung kesiapan tim dalam mempresentasikan laporan gabungan Python untuk Sains Data ini di hadapan dewan penguji, bagian lampiran ini merangkum pertanyaan-pertanyaan kritis beserta kunci jawaban ilmiah berbasis data dan rancangan kode program:</w:t>
       </w:r>
     </w:p>
     <w:bookmarkStart w:id="79" w:name="X978cb742b478b737e89431c04a630b8e503d09d"/>
@@ -17082,21 +17066,21 @@
           <w:bCs/>
           <w:sz w:val="24"/>
         </w:rPr>
-        <w:t xml:space="preserve">Klaster 8 (Confectionery &amp; Olahan Susu)</w:t>
-      </w:r>
-      <w:r>
-        <w:rPr>
-          <w:rFonts w:ascii="Times New Roman" w:hAnsi="Times New Roman"/>
-          <w:sz w:val="24"/>
-        </w:rPr>
-        <w:t xml:space="preserve"> </w:t>
-      </w:r>
-      <w:r>
-        <w:rPr>
-          <w:rFonts w:ascii="Times New Roman" w:hAnsi="Times New Roman"/>
-          <w:sz w:val="24"/>
-        </w:rPr>
-        <w:t xml:space="preserve">memiliki rata-rata bahan aditif terbanyak per produk (11,3 aditif) dan mencatat</w:t>
+        <w:t xml:space="preserve">Klaster 4 (Olahan Tepung &amp; Sereal Fortifikasi)</w:t>
+      </w:r>
+      <w:r>
+        <w:rPr>
+          <w:rFonts w:ascii="Times New Roman" w:hAnsi="Times New Roman"/>
+          <w:sz w:val="24"/>
+        </w:rPr>
+        <w:t xml:space="preserve"> </w:t>
+      </w:r>
+      <w:r>
+        <w:rPr>
+          <w:rFonts w:ascii="Times New Roman" w:hAnsi="Times New Roman"/>
+          <w:sz w:val="24"/>
+        </w:rPr>
+        <w:t xml:space="preserve">memiliki rata-rata bahan aditif terbanyak per produk (24,8 aditif) dan mencatat</w:t>
       </w:r>
       <w:r>
         <w:rPr>
@@ -17112,7 +17096,7 @@
           <w:bCs/>
           <w:sz w:val="24"/>
         </w:rPr>
-        <w:t xml:space="preserve">kehalalan objektif terendah (82,6%)</w:t>
+        <w:t xml:space="preserve">kehalalan objektif terendah (2,7%)</w:t>
       </w:r>
       <w:r>
         <w:rPr>
@@ -17159,7 +17143,7 @@
           <w:rFonts w:ascii="Times New Roman" w:hAnsi="Times New Roman"/>
           <w:sz w:val="24"/>
         </w:rPr>
-        <w:t xml:space="preserve">(syubhat; terdeteksi muncul 620 kali di dataset, rawan babi).</w:t>
+        <w:t xml:space="preserve">(syubhat; terdeteksi muncul 81 kali di dataset, rawan babi).</w:t>
       </w:r>
     </w:p>
     <w:p>
@@ -17258,21 +17242,21 @@
           <w:bCs/>
           <w:sz w:val="24"/>
         </w:rPr>
-        <w:t xml:space="preserve">Klaster 1 (Bumbu &amp; Sup Instan)</w:t>
-      </w:r>
-      <w:r>
-        <w:rPr>
-          <w:rFonts w:ascii="Times New Roman" w:hAnsi="Times New Roman"/>
-          <w:sz w:val="24"/>
-        </w:rPr>
-        <w:t xml:space="preserve"> </w:t>
-      </w:r>
-      <w:r>
-        <w:rPr>
-          <w:rFonts w:ascii="Times New Roman" w:hAnsi="Times New Roman"/>
-          <w:sz w:val="24"/>
-        </w:rPr>
-        <w:t xml:space="preserve">memiliki kehalalan menengah yang didominasi daging sapi RPH dan MSG, sedangkan</w:t>
+        <w:t xml:space="preserve">Klaster 8 (Permen, Roti Manis &amp; Susu)</w:t>
+      </w:r>
+      <w:r>
+        <w:rPr>
+          <w:rFonts w:ascii="Times New Roman" w:hAnsi="Times New Roman"/>
+          <w:sz w:val="24"/>
+        </w:rPr>
+        <w:t xml:space="preserve"> </w:t>
+      </w:r>
+      <w:r>
+        <w:rPr>
+          <w:rFonts w:ascii="Times New Roman" w:hAnsi="Times New Roman"/>
+          <w:sz w:val="24"/>
+        </w:rPr>
+        <w:t xml:space="preserve">memiliki kehalalan menengah (38,2% Halal), sedangkan</w:t>
       </w:r>
       <w:r>
         <w:rPr>
@@ -17288,21 +17272,21 @@
           <w:bCs/>
           <w:sz w:val="24"/>
         </w:rPr>
-        <w:t xml:space="preserve">Klaster 3 (Jus &amp; Bubur Bayi)</w:t>
-      </w:r>
-      <w:r>
-        <w:rPr>
-          <w:rFonts w:ascii="Times New Roman" w:hAnsi="Times New Roman"/>
-          <w:sz w:val="24"/>
-        </w:rPr>
-        <w:t xml:space="preserve"> </w:t>
-      </w:r>
-      <w:r>
-        <w:rPr>
-          <w:rFonts w:ascii="Times New Roman" w:hAnsi="Times New Roman"/>
-          <w:sz w:val="24"/>
-        </w:rPr>
-        <w:t xml:space="preserve">serta</w:t>
+        <w:t xml:space="preserve">Klaster 7 (Pertanian Mentah)</w:t>
+      </w:r>
+      <w:r>
+        <w:rPr>
+          <w:rFonts w:ascii="Times New Roman" w:hAnsi="Times New Roman"/>
+          <w:sz w:val="24"/>
+        </w:rPr>
+        <w:t xml:space="preserve"> </w:t>
+      </w:r>
+      <w:r>
+        <w:rPr>
+          <w:rFonts w:ascii="Times New Roman" w:hAnsi="Times New Roman"/>
+          <w:sz w:val="24"/>
+        </w:rPr>
+        <w:t xml:space="preserve">memiliki kehalalan tertinggi mencapai</w:t>
       </w:r>
       <w:r>
         <w:rPr>
@@ -17318,37 +17302,7 @@
           <w:bCs/>
           <w:sz w:val="24"/>
         </w:rPr>
-        <w:t xml:space="preserve">Klaster 7 (Pertanian Mentah)</w:t>
-      </w:r>
-      <w:r>
-        <w:rPr>
-          <w:rFonts w:ascii="Times New Roman" w:hAnsi="Times New Roman"/>
-          <w:sz w:val="24"/>
-        </w:rPr>
-        <w:t xml:space="preserve"> </w:t>
-      </w:r>
-      <w:r>
-        <w:rPr>
-          <w:rFonts w:ascii="Times New Roman" w:hAnsi="Times New Roman"/>
-          <w:sz w:val="24"/>
-        </w:rPr>
-        <w:t xml:space="preserve">memiliki kehalalan tertinggi mencapai</w:t>
-      </w:r>
-      <w:r>
-        <w:rPr>
-          <w:rFonts w:ascii="Times New Roman" w:hAnsi="Times New Roman"/>
-          <w:sz w:val="24"/>
-        </w:rPr>
-        <w:t xml:space="preserve"> </w:t>
-      </w:r>
-      <w:r>
-        <w:rPr>
-          <w:rFonts w:ascii="Times New Roman" w:hAnsi="Times New Roman"/>
-          <w:b/>
-          <w:bCs/>
-          <w:sz w:val="24"/>
-        </w:rPr>
-        <w:t xml:space="preserve">98,1%</w:t>
+        <w:t xml:space="preserve">97,8%</w:t>
       </w:r>
       <w:r>
         <w:rPr>

</xml_diff>

<commit_message>
docs: remove summary infographic fig5 and update reports
</commit_message>
<xml_diff>
--- a/reports/Laporan_Gabungan_Data_Storytelling_Halal_Final.docx
+++ b/reports/Laporan_Gabungan_Data_Storytelling_Halal_Final.docx
@@ -2,7 +2,7 @@
 <file path=word/document.xml><?xml version="1.0" encoding="utf-8"?>
 <w:document xmlns:w="http://schemas.openxmlformats.org/wordprocessingml/2006/main" xmlns:m="http://schemas.openxmlformats.org/officeDocument/2006/math" xmlns:r="http://schemas.openxmlformats.org/officeDocument/2006/relationships" xmlns:o="urn:schemas-microsoft-com:office:office" xmlns:v="urn:schemas-microsoft-com:vml" xmlns:w10="urn:schemas-microsoft-com:office:word" xmlns:a="http://schemas.openxmlformats.org/drawingml/2006/main" xmlns:pic="http://schemas.openxmlformats.org/drawingml/2006/picture" xmlns:wp="http://schemas.openxmlformats.org/drawingml/2006/wordprocessingDrawing">
   <w:body>
-    <w:bookmarkStart w:id="85" w:name="X19dcd93239a5d7fbec1342a4c6d23dd49ec46a0"/>
+    <w:bookmarkStart w:id="82" w:name="X19dcd93239a5d7fbec1342a4c6d23dd49ec46a0"/>
     <w:p>
       <w:pPr>
         <w:pStyle w:val="Heading1"/>
@@ -7391,7 +7391,7 @@
     </w:p>
     <w:bookmarkEnd w:id="33"/>
     <w:bookmarkEnd w:id="34"/>
-    <w:bookmarkStart w:id="71" w:name="bab-iv-hasil-dan-pembahasan"/>
+    <w:bookmarkStart w:id="68" w:name="bab-iv-hasil-dan-pembahasan"/>
     <w:p>
       <w:pPr>
         <w:pStyle w:val="Heading2"/>
@@ -11986,7 +11986,7 @@
       </w:r>
     </w:p>
     <w:bookmarkEnd w:id="48"/>
-    <w:bookmarkStart w:id="68" w:name="X4192c41f03f2ecff0bf2ced2a95f639f26b9287"/>
+    <w:bookmarkStart w:id="65" w:name="X4192c41f03f2ecff0bf2ced2a95f639f26b9287"/>
     <w:p>
       <w:pPr>
         <w:pStyle w:val="Heading3"/>
@@ -12605,84 +12605,6 @@
           <w:rFonts w:ascii="Times New Roman" w:hAnsi="Times New Roman"/>
           <w:sz w:val="24"/>
         </w:rPr>
-        <w:t xml:space="preserve">Untuk menyederhanakan temuan-temuan kunci tersebut bagi pemangku kepentingan, seluruh intisari analisis dirangkum dalam kartu visual infografis berikut.</w:t>
-      </w:r>
-    </w:p>
-    <w:p>
-      <w:pPr>
-        <w:pStyle w:val="CaptionedFigure"/>
-        <w:jc w:val="both"/>
-      </w:pPr>
-      <w:r>
-        <w:rPr>
-          <w:rFonts w:ascii="Times New Roman" w:hAnsi="Times New Roman"/>
-          <w:sz w:val="24"/>
-        </w:rPr>
-        <w:drawing>
-          <wp:inline>
-            <wp:extent cx="5334000" cy="3636818"/>
-            <wp:effectExtent b="0" l="0" r="0" t="0"/>
-            <wp:docPr descr="Infografis Ringkasan Insight" title="" id="62" name="Picture"/>
-            <a:graphic>
-              <a:graphicData uri="http://schemas.openxmlformats.org/drawingml/2006/picture">
-                <pic:pic>
-                  <pic:nvPicPr>
-                    <pic:cNvPr descr="output_halal/fig5_insight_summary.png" id="63" name="Picture"/>
-                    <pic:cNvPicPr>
-                      <a:picLocks noChangeArrowheads="1" noChangeAspect="1"/>
-                    </pic:cNvPicPr>
-                  </pic:nvPicPr>
-                  <pic:blipFill>
-                    <a:blip r:embed="rId61"/>
-                    <a:stretch>
-                      <a:fillRect/>
-                    </a:stretch>
-                  </pic:blipFill>
-                  <pic:spPr bwMode="auto">
-                    <a:xfrm>
-                      <a:off x="0" y="0"/>
-                      <a:ext cx="5334000" cy="3636818"/>
-                    </a:xfrm>
-                    <a:prstGeom prst="rect">
-                      <a:avLst/>
-                    </a:prstGeom>
-                    <a:noFill/>
-                    <a:ln w="9525">
-                      <a:noFill/>
-                      <a:headEnd/>
-                      <a:tailEnd/>
-                    </a:ln>
-                  </pic:spPr>
-                </pic:pic>
-              </a:graphicData>
-            </a:graphic>
-          </wp:inline>
-        </w:drawing>
-      </w:r>
-    </w:p>
-    <w:p>
-      <w:pPr>
-        <w:pStyle w:val="ImageCaption"/>
-        <w:jc w:val="both"/>
-      </w:pPr>
-      <w:r>
-        <w:rPr>
-          <w:rFonts w:ascii="Times New Roman" w:hAnsi="Times New Roman"/>
-          <w:sz w:val="24"/>
-        </w:rPr>
-        <w:t xml:space="preserve">Infografis Ringkasan Insight</w:t>
-      </w:r>
-    </w:p>
-    <w:p>
-      <w:pPr>
-        <w:pStyle w:val="BodyText"/>
-        <w:jc w:val="both"/>
-      </w:pPr>
-      <w:r>
-        <w:rPr>
-          <w:rFonts w:ascii="Times New Roman" w:hAnsi="Times New Roman"/>
-          <w:sz w:val="24"/>
-        </w:rPr>
         <w:t xml:space="preserve">Sebagai puncak dari rangkaian</w:t>
       </w:r>
       <w:r>
@@ -12745,7 +12667,7 @@
         </w:rPr>
         <w:t xml:space="preserve"> </w:t>
       </w:r>
-      <w:hyperlink r:id="rId64">
+      <w:hyperlink r:id="rId61">
         <w:r>
           <w:rPr>
             <w:rStyle w:val="Hyperlink"/>
@@ -12775,18 +12697,18 @@
           <wp:inline>
             <wp:extent cx="5334000" cy="2922240"/>
             <wp:effectExtent b="0" l="0" r="0" t="0"/>
-            <wp:docPr descr="Purwarupa Web Dashboard Interaktif - Halal Analyzer" title="" id="66" name="Picture"/>
+            <wp:docPr descr="Purwarupa Web Dashboard Interaktif - Halal Analyzer" title="" id="63" name="Picture"/>
             <a:graphic>
               <a:graphicData uri="http://schemas.openxmlformats.org/drawingml/2006/picture">
                 <pic:pic>
                   <pic:nvPicPr>
-                    <pic:cNvPr descr="output_halal/fig6_web_dashboard.png" id="67" name="Picture"/>
+                    <pic:cNvPr descr="output_halal/fig6_web_dashboard.png" id="64" name="Picture"/>
                     <pic:cNvPicPr>
                       <a:picLocks noChangeArrowheads="1" noChangeAspect="1"/>
                     </pic:cNvPicPr>
                   </pic:nvPicPr>
                   <pic:blipFill>
-                    <a:blip r:embed="rId65"/>
+                    <a:blip r:embed="rId62"/>
                     <a:stretch>
                       <a:fillRect/>
                     </a:stretch>
@@ -12973,8 +12895,8 @@
         </w:pict>
       </w:r>
     </w:p>
-    <w:bookmarkEnd w:id="68"/>
-    <w:bookmarkStart w:id="69" w:name="temuan-utama-data-storytelling-insights"/>
+    <w:bookmarkEnd w:id="65"/>
+    <w:bookmarkStart w:id="66" w:name="temuan-utama-data-storytelling-insights"/>
     <w:p>
       <w:pPr>
         <w:pStyle w:val="Heading3"/>
@@ -13537,8 +13459,8 @@
         </w:pict>
       </w:r>
     </w:p>
-    <w:bookmarkEnd w:id="69"/>
-    <w:bookmarkStart w:id="70" w:name="tabel-ringkasan-risiko-klaster-halal"/>
+    <w:bookmarkEnd w:id="66"/>
+    <w:bookmarkStart w:id="67" w:name="tabel-ringkasan-risiko-klaster-halal"/>
     <w:p>
       <w:pPr>
         <w:pStyle w:val="Heading3"/>
@@ -14463,9 +14385,9 @@
         </w:tc>
       </w:tr>
     </w:tbl>
-    <w:bookmarkEnd w:id="70"/>
-    <w:bookmarkEnd w:id="71"/>
-    <w:bookmarkStart w:id="74" w:name="bab-v-kesimpulan-dan-saran"/>
+    <w:bookmarkEnd w:id="67"/>
+    <w:bookmarkEnd w:id="68"/>
+    <w:bookmarkStart w:id="71" w:name="bab-v-kesimpulan-dan-saran"/>
     <w:p>
       <w:pPr>
         <w:pStyle w:val="Heading2"/>
@@ -14477,7 +14399,7 @@
         <w:t xml:space="preserve">BAB V: KESIMPULAN DAN SARAN</w:t>
       </w:r>
     </w:p>
-    <w:bookmarkStart w:id="72" w:name="kesimpulan"/>
+    <w:bookmarkStart w:id="69" w:name="kesimpulan"/>
     <w:p>
       <w:pPr>
         <w:pStyle w:val="Heading3"/>
@@ -14898,8 +14820,8 @@
         <w:t xml:space="preserve">Karakterisasi 8 klaster pangan riil berhasil memetakan titik kritis kehalalan (CCP) secara spesifik, memudahkan auditor halal fokus pada bahan kritis utama di masing-masing klaster (misalnya, L-sistein pada klaster tepung, gelatin pada klaster buah/jus, dan penyembelihan RPH pada klaster daging).</w:t>
       </w:r>
     </w:p>
-    <w:bookmarkEnd w:id="72"/>
-    <w:bookmarkStart w:id="73" w:name="saran"/>
+    <w:bookmarkEnd w:id="69"/>
+    <w:bookmarkStart w:id="70" w:name="saran"/>
     <w:p>
       <w:pPr>
         <w:pStyle w:val="Heading3"/>
@@ -15130,9 +15052,9 @@
         </w:pict>
       </w:r>
     </w:p>
-    <w:bookmarkEnd w:id="73"/>
-    <w:bookmarkEnd w:id="74"/>
-    <w:bookmarkStart w:id="75" w:name="daftar-pustaka"/>
+    <w:bookmarkEnd w:id="70"/>
+    <w:bookmarkEnd w:id="71"/>
+    <w:bookmarkStart w:id="72" w:name="daftar-pustaka"/>
     <w:p>
       <w:pPr>
         <w:pStyle w:val="Heading2"/>
@@ -15494,8 +15416,8 @@
         </w:pict>
       </w:r>
     </w:p>
-    <w:bookmarkEnd w:id="75"/>
-    <w:bookmarkStart w:id="84" w:name="X6c949f68e861d744fc1e57c0bae665ba8ffc7c8"/>
+    <w:bookmarkEnd w:id="72"/>
+    <w:bookmarkStart w:id="81" w:name="X6c949f68e861d744fc1e57c0bae665ba8ffc7c8"/>
     <w:p>
       <w:pPr>
         <w:pStyle w:val="Heading2"/>
@@ -15520,7 +15442,7 @@
         <w:t xml:space="preserve">Untuk mendukung kesiapan tim dalam mempresentasikan laporan gabungan Python untuk Sains Data ini di hadapan dewan penguji, bagian lampiran ini merangkum pertanyaan-pertanyaan kritis beserta kunci jawaban ilmiah berbasis data dan rancangan kode program:</w:t>
       </w:r>
     </w:p>
-    <w:bookmarkStart w:id="79" w:name="X978cb742b478b737e89431c04a630b8e503d09d"/>
+    <w:bookmarkStart w:id="76" w:name="X978cb742b478b737e89431c04a630b8e503d09d"/>
     <w:p>
       <w:pPr>
         <w:pStyle w:val="Heading3"/>
@@ -15532,7 +15454,7 @@
         <w:t xml:space="preserve">Sesi A: Landasan Matematis &amp; Metodologi Reduksi Dimensi</w:t>
       </w:r>
     </w:p>
-    <w:bookmarkStart w:id="76" w:name="Xa9e828d0fb7d5a9d351f0175fcb8d724b38350c"/>
+    <w:bookmarkStart w:id="73" w:name="Xa9e828d0fb7d5a9d351f0175fcb8d724b38350c"/>
     <w:p>
       <w:pPr>
         <w:pStyle w:val="Heading4"/>
@@ -15832,8 +15754,8 @@
         <w:t xml:space="preserve">yang menormalkan bobot kolom (bahan langka seperti gelatin babi diberi bobot lebih besar, sedangkan air/garam diredam) dan tidak menghitung kemunculan nol sebagai kemiripan resep.</w:t>
       </w:r>
     </w:p>
-    <w:bookmarkEnd w:id="76"/>
-    <w:bookmarkStart w:id="77" w:name="Xc6bc25995e99c99c37716001649a2f510cc3022"/>
+    <w:bookmarkEnd w:id="73"/>
+    <w:bookmarkStart w:id="74" w:name="Xc6bc25995e99c99c37716001649a2f510cc3022"/>
     <w:p>
       <w:pPr>
         <w:pStyle w:val="Heading4"/>
@@ -16118,8 +16040,8 @@
         <w:t xml:space="preserve">).</w:t>
       </w:r>
     </w:p>
-    <w:bookmarkEnd w:id="77"/>
-    <w:bookmarkStart w:id="78" w:name="X2450c0491191c5e0c75e03836b5546c9e3ff05c"/>
+    <w:bookmarkEnd w:id="74"/>
+    <w:bookmarkStart w:id="75" w:name="X2450c0491191c5e0c75e03836b5546c9e3ff05c"/>
     <w:p>
       <w:pPr>
         <w:pStyle w:val="Heading4"/>
@@ -16602,9 +16524,9 @@
         </w:pict>
       </w:r>
     </w:p>
-    <w:bookmarkEnd w:id="78"/>
-    <w:bookmarkEnd w:id="79"/>
-    <w:bookmarkStart w:id="83" w:name="X4131c911fb1dcf5ecabfeb5209583df7af83f53"/>
+    <w:bookmarkEnd w:id="75"/>
+    <w:bookmarkEnd w:id="76"/>
+    <w:bookmarkStart w:id="80" w:name="X4131c911fb1dcf5ecabfeb5209583df7af83f53"/>
     <w:p>
       <w:pPr>
         <w:pStyle w:val="Heading3"/>
@@ -16616,7 +16538,7 @@
         <w:t xml:space="preserve">Sesi B: Narasi Storytelling &amp; Hasil Klasterisasi</w:t>
       </w:r>
     </w:p>
-    <w:bookmarkStart w:id="80" w:name="X2a1f5b3f0bfcecd21f619262144e9a32b838681"/>
+    <w:bookmarkStart w:id="77" w:name="X2a1f5b3f0bfcecd21f619262144e9a32b838681"/>
     <w:p>
       <w:pPr>
         <w:pStyle w:val="Heading4"/>
@@ -16988,8 +16910,8 @@
         <w:t xml:space="preserve">bahan syubhat).</w:t>
       </w:r>
     </w:p>
-    <w:bookmarkEnd w:id="80"/>
-    <w:bookmarkStart w:id="81" w:name="X73a165f8f499be52ec40003b3921bc36054d1e1"/>
+    <w:bookmarkEnd w:id="77"/>
+    <w:bookmarkStart w:id="78" w:name="X73a165f8f499be52ec40003b3921bc36054d1e1"/>
     <w:p>
       <w:pPr>
         <w:pStyle w:val="Heading4"/>
@@ -17335,8 +17257,8 @@
         <w:t xml:space="preserve">).</w:t>
       </w:r>
     </w:p>
-    <w:bookmarkEnd w:id="81"/>
-    <w:bookmarkStart w:id="82" w:name="X5a446dc03dce1c4038fcf5785fb4b6f7be5b341"/>
+    <w:bookmarkEnd w:id="78"/>
+    <w:bookmarkStart w:id="79" w:name="X5a446dc03dce1c4038fcf5785fb4b6f7be5b341"/>
     <w:p>
       <w:pPr>
         <w:pStyle w:val="Heading4"/>
@@ -17456,10 +17378,10 @@
         <w:t xml:space="preserve">: Mengintegrasikan sistem penapisan otomatis berbasis risiko komposisi digital pada portal SIHALAL untuk menyaring bahan baku rawan haram saat produsen mendaftarkan resep baru.</w:t>
       </w:r>
     </w:p>
+    <w:bookmarkEnd w:id="79"/>
+    <w:bookmarkEnd w:id="80"/>
+    <w:bookmarkEnd w:id="81"/>
     <w:bookmarkEnd w:id="82"/>
-    <w:bookmarkEnd w:id="83"/>
-    <w:bookmarkEnd w:id="84"/>
-    <w:bookmarkEnd w:id="85"/>
     <w:sectPr>
       <w:footnotePr>
         <w:numRestart w:val="eachSect"/>

</xml_diff>

<commit_message>
docs: remove roles column, update GitHub repository link, remove horizontal rules, and style headings black
</commit_message>
<xml_diff>
--- a/reports/Laporan_Gabungan_Data_Storytelling_Halal_Final.docx
+++ b/reports/Laporan_Gabungan_Data_Storytelling_Halal_Final.docx
@@ -10,6 +10,7 @@
       <w:r>
         <w:rPr>
           <w:rFonts w:ascii="Times New Roman" w:hAnsi="Times New Roman"/>
+          <w:color w:val="000000"/>
         </w:rPr>
         <w:t xml:space="preserve">LAPORAN GABUNGAN PENELITIAN &amp; DATA STORYTELLING</w:t>
       </w:r>
@@ -22,6 +23,7 @@
       <w:r>
         <w:rPr>
           <w:rFonts w:ascii="Times New Roman" w:hAnsi="Times New Roman"/>
+          <w:color w:val="000000"/>
         </w:rPr>
         <w:t xml:space="preserve">MATAKULIAH: PYTHON UNTUK SAINS DATA (TUGAS PROYEK AKHIR KELOMPOK)</w:t>
       </w:r>
@@ -34,22 +36,9 @@
       <w:r>
         <w:rPr>
           <w:rFonts w:ascii="Times New Roman" w:hAnsi="Times New Roman"/>
+          <w:color w:val="000000"/>
         </w:rPr>
         <w:t xml:space="preserve">TOPIK: NAVIGASI INTEGRITAS HALAL — PEMETAAN KOMPUTASIONAL BAHAN PANGAN RIIL BERBASIS MULTIPLE CORRESPONDENCE ANALYSIS (MCA) DAN SPARSE RBF SPECTRAL CLUSTERING</w:t>
-      </w:r>
-    </w:p>
-    <w:p>
-      <w:pPr>
-        <w:jc w:val="both"/>
-      </w:pPr>
-      <w:r>
-        <w:rPr>
-          <w:rFonts w:ascii="Times New Roman" w:hAnsi="Times New Roman"/>
-          <w:sz w:val="24"/>
-        </w:rPr>
-        <w:pict>
-          <v:rect style="width:0;height:1.5pt" o:hralign="center" o:hrstd="t" o:hr="t"/>
-        </w:pict>
       </w:r>
     </w:p>
     <w:bookmarkEnd w:id="9"/>
@@ -62,6 +51,7 @@
       <w:r>
         <w:rPr>
           <w:rFonts w:ascii="Times New Roman" w:hAnsi="Times New Roman"/>
+          <w:color w:val="000000"/>
         </w:rPr>
         <w:t xml:space="preserve">IDENTITAS ANGGOTA KELOMPOK</w:t>
       </w:r>
@@ -69,15 +59,13 @@
     <w:tbl>
       <w:tblPr>
         <w:tblStyle w:val="Table"/>
-        <w:tblW w:type="pct" w:w="5000"/>
-        <w:tblLayout w:type="fixed"/>
+        <w:tblW w:type="auto" w:w="0"/>
         <w:tblLook w:firstRow="1" w:lastRow="0" w:firstColumn="0" w:lastColumn="0" w:noHBand="0" w:noVBand="0" w:val="0020"/>
       </w:tblPr>
       <w:tblGrid>
-        <w:gridCol w:w="1440"/>
-        <w:gridCol w:w="2160"/>
-        <w:gridCol w:w="1800"/>
-        <w:gridCol w:w="2520"/>
+        <w:gridCol w:w="2640"/>
+        <w:gridCol w:w="2640"/>
+        <w:gridCol w:w="2640"/>
       </w:tblGrid>
       <w:tr>
         <w:trPr>
@@ -128,22 +116,6 @@
                 <w:sz w:val="24"/>
               </w:rPr>
               <w:t xml:space="preserve">NIM</w:t>
-            </w:r>
-          </w:p>
-        </w:tc>
-        <w:tc>
-          <w:tcPr/>
-          <w:p>
-            <w:pPr>
-              <w:pStyle w:val="Compact"/>
-              <w:jc w:val="both"/>
-            </w:pPr>
-            <w:r>
-              <w:rPr>
-                <w:rFonts w:ascii="Times New Roman" w:hAnsi="Times New Roman"/>
-                <w:sz w:val="24"/>
-              </w:rPr>
-              <w:t xml:space="preserve">Peran</w:t>
             </w:r>
           </w:p>
         </w:tc>
@@ -199,22 +171,6 @@
             </w:r>
           </w:p>
         </w:tc>
-        <w:tc>
-          <w:tcPr/>
-          <w:p>
-            <w:pPr>
-              <w:pStyle w:val="Compact"/>
-              <w:jc w:val="both"/>
-            </w:pPr>
-            <w:r>
-              <w:rPr>
-                <w:rFonts w:ascii="Times New Roman" w:hAnsi="Times New Roman"/>
-                <w:sz w:val="24"/>
-              </w:rPr>
-              <w:t xml:space="preserve">Ketua / Data Wrangling &amp; Parser</w:t>
-            </w:r>
-          </w:p>
-        </w:tc>
       </w:tr>
       <w:tr>
         <w:tc>
@@ -262,22 +218,6 @@
                 <w:sz w:val="24"/>
               </w:rPr>
               <w:t xml:space="preserve">247411007</w:t>
-            </w:r>
-          </w:p>
-        </w:tc>
-        <w:tc>
-          <w:tcPr/>
-          <w:p>
-            <w:pPr>
-              <w:pStyle w:val="Compact"/>
-              <w:jc w:val="both"/>
-            </w:pPr>
-            <w:r>
-              <w:rPr>
-                <w:rFonts w:ascii="Times New Roman" w:hAnsi="Times New Roman"/>
-                <w:sz w:val="24"/>
-              </w:rPr>
-              <w:t xml:space="preserve">Pemodelan Matematika &amp; MCA</w:t>
             </w:r>
           </w:p>
         </w:tc>
@@ -331,22 +271,6 @@
             </w:r>
           </w:p>
         </w:tc>
-        <w:tc>
-          <w:tcPr/>
-          <w:p>
-            <w:pPr>
-              <w:pStyle w:val="Compact"/>
-              <w:jc w:val="both"/>
-            </w:pPr>
-            <w:r>
-              <w:rPr>
-                <w:rFonts w:ascii="Times New Roman" w:hAnsi="Times New Roman"/>
-                <w:sz w:val="24"/>
-              </w:rPr>
-              <w:t xml:space="preserve">Spectral Clustering &amp; Evaluasi</w:t>
-            </w:r>
-          </w:p>
-        </w:tc>
       </w:tr>
       <w:tr>
         <w:tc>
@@ -394,22 +318,6 @@
                 <w:sz w:val="24"/>
               </w:rPr>
               <w:t xml:space="preserve">247411019</w:t>
-            </w:r>
-          </w:p>
-        </w:tc>
-        <w:tc>
-          <w:tcPr/>
-          <w:p>
-            <w:pPr>
-              <w:pStyle w:val="Compact"/>
-              <w:jc w:val="both"/>
-            </w:pPr>
-            <w:r>
-              <w:rPr>
-                <w:rFonts w:ascii="Times New Roman" w:hAnsi="Times New Roman"/>
-                <w:sz w:val="24"/>
-              </w:rPr>
-              <w:t xml:space="preserve">Visualisasi UMAP &amp; Heatmap</w:t>
             </w:r>
           </w:p>
         </w:tc>
@@ -463,22 +371,6 @@
             </w:r>
           </w:p>
         </w:tc>
-        <w:tc>
-          <w:tcPr/>
-          <w:p>
-            <w:pPr>
-              <w:pStyle w:val="Compact"/>
-              <w:jc w:val="both"/>
-            </w:pPr>
-            <w:r>
-              <w:rPr>
-                <w:rFonts w:ascii="Times New Roman" w:hAnsi="Times New Roman"/>
-                <w:sz w:val="24"/>
-              </w:rPr>
-              <w:t xml:space="preserve">Storytelling &amp; Laporan</w:t>
-            </w:r>
-          </w:p>
-        </w:tc>
       </w:tr>
       <w:tr>
         <w:tc>
@@ -529,38 +421,8 @@
             </w:r>
           </w:p>
         </w:tc>
-        <w:tc>
-          <w:tcPr/>
-          <w:p>
-            <w:pPr>
-              <w:pStyle w:val="Compact"/>
-              <w:jc w:val="both"/>
-            </w:pPr>
-            <w:r>
-              <w:rPr>
-                <w:rFonts w:ascii="Times New Roman" w:hAnsi="Times New Roman"/>
-                <w:sz w:val="24"/>
-              </w:rPr>
-              <w:t xml:space="preserve">Presentasi &amp; Validasi</w:t>
-            </w:r>
-          </w:p>
-        </w:tc>
       </w:tr>
     </w:tbl>
-    <w:p>
-      <w:pPr>
-        <w:jc w:val="both"/>
-      </w:pPr>
-      <w:r>
-        <w:rPr>
-          <w:rFonts w:ascii="Times New Roman" w:hAnsi="Times New Roman"/>
-          <w:sz w:val="24"/>
-        </w:rPr>
-        <w:pict>
-          <v:rect style="width:0;height:1.5pt" o:hralign="center" o:hrstd="t" o:hr="t"/>
-        </w:pict>
-      </w:r>
-    </w:p>
     <w:bookmarkEnd w:id="11"/>
     <w:bookmarkStart w:id="12" w:name="ringkasan-eksekutif"/>
     <w:p>
@@ -570,6 +432,7 @@
       <w:r>
         <w:rPr>
           <w:rFonts w:ascii="Times New Roman" w:hAnsi="Times New Roman"/>
+          <w:color w:val="000000"/>
         </w:rPr>
         <w:t xml:space="preserve">Ringkasan Eksekutif</w:t>
       </w:r>
@@ -1073,20 +936,6 @@
         <w:t xml:space="preserve">produk bersertifikat administratif justru menyembunyikan komposisi bahan bakunya, menyoroti pentingnya audit bahan baku secara objektif dan spasial.</w:t>
       </w:r>
     </w:p>
-    <w:p>
-      <w:pPr>
-        <w:jc w:val="both"/>
-      </w:pPr>
-      <w:r>
-        <w:rPr>
-          <w:rFonts w:ascii="Times New Roman" w:hAnsi="Times New Roman"/>
-          <w:sz w:val="24"/>
-        </w:rPr>
-        <w:pict>
-          <v:rect style="width:0;height:1.5pt" o:hralign="center" o:hrstd="t" o:hr="t"/>
-        </w:pict>
-      </w:r>
-    </w:p>
     <w:bookmarkEnd w:id="12"/>
     <w:bookmarkStart w:id="16" w:name="bab-i-pendahuluan"/>
     <w:p>
@@ -1096,6 +945,7 @@
       <w:r>
         <w:rPr>
           <w:rFonts w:ascii="Times New Roman" w:hAnsi="Times New Roman"/>
+          <w:color w:val="000000"/>
         </w:rPr>
         <w:t xml:space="preserve">BAB I: PENDAHULUAN</w:t>
       </w:r>
@@ -1108,6 +958,7 @@
       <w:r>
         <w:rPr>
           <w:rFonts w:ascii="Times New Roman" w:hAnsi="Times New Roman"/>
+          <w:color w:val="000000"/>
         </w:rPr>
         <w:t xml:space="preserve">1.1 Latar Belakang</w:t>
       </w:r>
@@ -1322,6 +1173,7 @@
       <w:r>
         <w:rPr>
           <w:rFonts w:ascii="Times New Roman" w:hAnsi="Times New Roman"/>
+          <w:color w:val="000000"/>
         </w:rPr>
         <w:t xml:space="preserve">1.2 Rumusan Masalah</w:t>
       </w:r>
@@ -1380,6 +1232,7 @@
       <w:r>
         <w:rPr>
           <w:rFonts w:ascii="Times New Roman" w:hAnsi="Times New Roman"/>
+          <w:color w:val="000000"/>
         </w:rPr>
         <w:t xml:space="preserve">1.3 Tujuan Penelitian &amp; Proyek Storytelling</w:t>
       </w:r>
@@ -1453,20 +1306,6 @@
           <w:sz w:val="24"/>
         </w:rPr>
         <w:t xml:space="preserve">) dan merumuskan rekomendasi titik kritis kehalalan (CCP).</w:t>
-      </w:r>
-    </w:p>
-    <w:p>
-      <w:pPr>
-        <w:jc w:val="both"/>
-      </w:pPr>
-      <w:r>
-        <w:rPr>
-          <w:rFonts w:ascii="Times New Roman" w:hAnsi="Times New Roman"/>
-          <w:sz w:val="24"/>
-        </w:rPr>
-        <w:pict>
-          <v:rect style="width:0;height:1.5pt" o:hralign="center" o:hrstd="t" o:hr="t"/>
-        </w:pict>
       </w:r>
     </w:p>
     <w:bookmarkEnd w:id="15"/>
@@ -1479,6 +1318,7 @@
       <w:r>
         <w:rPr>
           <w:rFonts w:ascii="Times New Roman" w:hAnsi="Times New Roman"/>
+          <w:color w:val="000000"/>
         </w:rPr>
         <w:t xml:space="preserve">BAB II: TINJAUAN PUSTAKA</w:t>
       </w:r>
@@ -1491,6 +1331,7 @@
       <w:r>
         <w:rPr>
           <w:rFonts w:ascii="Times New Roman" w:hAnsi="Times New Roman"/>
+          <w:color w:val="000000"/>
         </w:rPr>
         <w:t xml:space="preserve">2.1 Multiple Correspondence Analysis (MCA)</w:t>
       </w:r>
@@ -2356,6 +2197,7 @@
       <w:r>
         <w:rPr>
           <w:rFonts w:ascii="Times New Roman" w:hAnsi="Times New Roman"/>
+          <w:color w:val="000000"/>
         </w:rPr>
         <w:t xml:space="preserve">2.2 Batasan Geometris K-Means</w:t>
       </w:r>
@@ -2560,6 +2402,7 @@
       <w:r>
         <w:rPr>
           <w:rFonts w:ascii="Times New Roman" w:hAnsi="Times New Roman"/>
+          <w:color w:val="000000"/>
         </w:rPr>
         <w:t xml:space="preserve">2.3 Spectral Clustering dan Matriks Laplacian Graf</w:t>
       </w:r>
@@ -3268,6 +3111,7 @@
       <w:r>
         <w:rPr>
           <w:rFonts w:ascii="Times New Roman" w:hAnsi="Times New Roman"/>
+          <w:color w:val="000000"/>
         </w:rPr>
         <w:t xml:space="preserve">2.4 Visualisasi Spasial UMAP</w:t>
       </w:r>
@@ -3646,20 +3490,6 @@
         <w:t xml:space="preserve">di dimensi rendah. UMAP mempertahankan struktur lokal graf ketetanggaan secara konsisten dengan Spectral Clustering.</w:t>
       </w:r>
     </w:p>
-    <w:p>
-      <w:pPr>
-        <w:jc w:val="both"/>
-      </w:pPr>
-      <w:r>
-        <w:rPr>
-          <w:rFonts w:ascii="Times New Roman" w:hAnsi="Times New Roman"/>
-          <w:sz w:val="24"/>
-        </w:rPr>
-        <w:pict>
-          <v:rect style="width:0;height:1.5pt" o:hralign="center" o:hrstd="t" o:hr="t"/>
-        </w:pict>
-      </w:r>
-    </w:p>
     <w:bookmarkEnd w:id="20"/>
     <w:bookmarkEnd w:id="21"/>
     <w:bookmarkStart w:id="34" w:name="bab-iii-metodologi-penelitian"/>
@@ -3670,6 +3500,7 @@
       <w:r>
         <w:rPr>
           <w:rFonts w:ascii="Times New Roman" w:hAnsi="Times New Roman"/>
+          <w:color w:val="000000"/>
         </w:rPr>
         <w:t xml:space="preserve">BAB III: METODOLOGI PENELITIAN</w:t>
       </w:r>
@@ -3682,6 +3513,7 @@
       <w:r>
         <w:rPr>
           <w:rFonts w:ascii="Times New Roman" w:hAnsi="Times New Roman"/>
+          <w:color w:val="000000"/>
         </w:rPr>
         <w:t xml:space="preserve">3.1 Pendekatan Metodologi: CRISP-DM</w:t>
       </w:r>
@@ -3738,6 +3570,7 @@
       <w:r>
         <w:rPr>
           <w:rFonts w:ascii="Times New Roman" w:hAnsi="Times New Roman"/>
+          <w:color w:val="000000"/>
         </w:rPr>
         <w:t xml:space="preserve">3.2 Diagram Alir Penelitian (End-to-End Pipeline)</w:t>
       </w:r>
@@ -3816,6 +3649,7 @@
       <w:r>
         <w:rPr>
           <w:rFonts w:ascii="Times New Roman" w:hAnsi="Times New Roman"/>
+          <w:color w:val="000000"/>
         </w:rPr>
         <w:t xml:space="preserve">3.2 Sumber Data</w:t>
       </w:r>
@@ -3904,7 +3738,7 @@
           <w:rPr>
             <w:rStyle w:val="Hyperlink"/>
           </w:rPr>
-          <w:t xml:space="preserve">anwarrohmadi2006/halal-analyzer</w:t>
+          <w:t xml:space="preserve">anwarrohmadi2006/halal-integrity-analytics</w:t>
         </w:r>
       </w:hyperlink>
       <w:r>
@@ -3953,6 +3787,7 @@
       <w:r>
         <w:rPr>
           <w:rFonts w:ascii="Times New Roman" w:hAnsi="Times New Roman"/>
+          <w:color w:val="000000"/>
         </w:rPr>
         <w:t xml:space="preserve">Ringkasan Volume Data:</w:t>
       </w:r>
@@ -4132,6 +3967,7 @@
       <w:r>
         <w:rPr>
           <w:rFonts w:ascii="Times New Roman" w:hAnsi="Times New Roman"/>
+          <w:color w:val="000000"/>
         </w:rPr>
         <w:t xml:space="preserve">3.3 Ekstraksi Data dari Semantic Web (RDF Turtle to Tabular)</w:t>
       </w:r>
@@ -5260,6 +5096,7 @@
       <w:r>
         <w:rPr>
           <w:rFonts w:ascii="Times New Roman" w:hAnsi="Times New Roman"/>
+          <w:color w:val="000000"/>
         </w:rPr>
         <w:t xml:space="preserve">3.4 Proses Data Wrangling &amp; Preprocessing</w:t>
       </w:r>
@@ -6693,6 +6530,7 @@
       <w:r>
         <w:rPr>
           <w:rFonts w:ascii="Times New Roman" w:hAnsi="Times New Roman"/>
+          <w:color w:val="000000"/>
         </w:rPr>
         <w:t xml:space="preserve">3.5 Penentuan Dimensi MCA (Kaiser vs. Greenacre)</w:t>
       </w:r>
@@ -7041,6 +6879,7 @@
       <w:r>
         <w:rPr>
           <w:rFonts w:ascii="Times New Roman" w:hAnsi="Times New Roman"/>
+          <w:color w:val="000000"/>
         </w:rPr>
         <w:t xml:space="preserve">3.6 Parameter Pemodelan</w:t>
       </w:r>
@@ -7375,20 +7214,6 @@
         <w:t xml:space="preserve">, dijalankan langsung pada koordinat MCA 8D.</w:t>
       </w:r>
     </w:p>
-    <w:p>
-      <w:pPr>
-        <w:jc w:val="both"/>
-      </w:pPr>
-      <w:r>
-        <w:rPr>
-          <w:rFonts w:ascii="Times New Roman" w:hAnsi="Times New Roman"/>
-          <w:sz w:val="24"/>
-        </w:rPr>
-        <w:pict>
-          <v:rect style="width:0;height:1.5pt" o:hralign="center" o:hrstd="t" o:hr="t"/>
-        </w:pict>
-      </w:r>
-    </w:p>
     <w:bookmarkEnd w:id="33"/>
     <w:bookmarkEnd w:id="34"/>
     <w:bookmarkStart w:id="68" w:name="bab-iv-hasil-dan-pembahasan"/>
@@ -7399,6 +7224,7 @@
       <w:r>
         <w:rPr>
           <w:rFonts w:ascii="Times New Roman" w:hAnsi="Times New Roman"/>
+          <w:color w:val="000000"/>
         </w:rPr>
         <w:t xml:space="preserve">BAB IV: HASIL DAN PEMBAHASAN</w:t>
       </w:r>
@@ -7411,6 +7237,7 @@
       <w:r>
         <w:rPr>
           <w:rFonts w:ascii="Times New Roman" w:hAnsi="Times New Roman"/>
+          <w:color w:val="000000"/>
         </w:rPr>
         <w:t xml:space="preserve">4.1 Hasil Data Wrangling &amp; Analisis Exploratory (EDA)</w:t>
       </w:r>
@@ -7641,6 +7468,7 @@
       <w:r>
         <w:rPr>
           <w:rFonts w:ascii="Times New Roman" w:hAnsi="Times New Roman"/>
+          <w:color w:val="000000"/>
         </w:rPr>
         <w:t xml:space="preserve">4.2 Tabel Uji Metrik Komparatif Riil</w:t>
       </w:r>
@@ -8644,6 +8472,7 @@
       <w:r>
         <w:rPr>
           <w:rFonts w:ascii="Times New Roman" w:hAnsi="Times New Roman"/>
+          <w:color w:val="000000"/>
         </w:rPr>
         <w:t xml:space="preserve">4.3 Analisis Kritis Perbandingan Metrik</w:t>
       </w:r>
@@ -8969,6 +8798,7 @@
       <w:r>
         <w:rPr>
           <w:rFonts w:ascii="Times New Roman" w:hAnsi="Times New Roman"/>
+          <w:color w:val="000000"/>
         </w:rPr>
         <w:t xml:space="preserve">4.4 Analisis Komprehensif Karakteristik 8 Klaster Optimal</w:t>
       </w:r>
@@ -11574,20 +11404,6 @@
         <w:t xml:space="preserve">.</w:t>
       </w:r>
     </w:p>
-    <w:p>
-      <w:pPr>
-        <w:jc w:val="both"/>
-      </w:pPr>
-      <w:r>
-        <w:rPr>
-          <w:rFonts w:ascii="Times New Roman" w:hAnsi="Times New Roman"/>
-          <w:sz w:val="24"/>
-        </w:rPr>
-        <w:pict>
-          <v:rect style="width:0;height:1.5pt" o:hralign="center" o:hrstd="t" o:hr="t"/>
-        </w:pict>
-      </w:r>
-    </w:p>
     <w:bookmarkEnd w:id="38"/>
     <w:bookmarkStart w:id="48" w:name="peta-spektral-visualisasi-permodelan"/>
     <w:p>
@@ -11597,6 +11413,7 @@
       <w:r>
         <w:rPr>
           <w:rFonts w:ascii="Times New Roman" w:hAnsi="Times New Roman"/>
+          <w:color w:val="000000"/>
         </w:rPr>
         <w:t xml:space="preserve">4.5 Peta Spektral &amp; Visualisasi Permodelan</w:t>
       </w:r>
@@ -11994,6 +11811,7 @@
       <w:r>
         <w:rPr>
           <w:rFonts w:ascii="Times New Roman" w:hAnsi="Times New Roman"/>
+          <w:color w:val="000000"/>
         </w:rPr>
         <w:t xml:space="preserve">4.6 Narasi Visualisasi dan Analisis Storytelling</w:t>
       </w:r>
@@ -12881,20 +12699,6 @@
         <w:t xml:space="preserve">) pada sistem regulasi jaminan produk halal nasional di masa depan.</w:t>
       </w:r>
     </w:p>
-    <w:p>
-      <w:pPr>
-        <w:jc w:val="both"/>
-      </w:pPr>
-      <w:r>
-        <w:rPr>
-          <w:rFonts w:ascii="Times New Roman" w:hAnsi="Times New Roman"/>
-          <w:sz w:val="24"/>
-        </w:rPr>
-        <w:pict>
-          <v:rect style="width:0;height:1.5pt" o:hralign="center" o:hrstd="t" o:hr="t"/>
-        </w:pict>
-      </w:r>
-    </w:p>
     <w:bookmarkEnd w:id="65"/>
     <w:bookmarkStart w:id="66" w:name="temuan-utama-data-storytelling-insights"/>
     <w:p>
@@ -12904,6 +12708,7 @@
       <w:r>
         <w:rPr>
           <w:rFonts w:ascii="Times New Roman" w:hAnsi="Times New Roman"/>
+          <w:color w:val="000000"/>
         </w:rPr>
         <w:t xml:space="preserve">4.7 Temuan Utama Data Storytelling (Insights)</w:t>
       </w:r>
@@ -13445,20 +13250,6 @@
         <w:t xml:space="preserve">).</w:t>
       </w:r>
     </w:p>
-    <w:p>
-      <w:pPr>
-        <w:jc w:val="both"/>
-      </w:pPr>
-      <w:r>
-        <w:rPr>
-          <w:rFonts w:ascii="Times New Roman" w:hAnsi="Times New Roman"/>
-          <w:sz w:val="24"/>
-        </w:rPr>
-        <w:pict>
-          <v:rect style="width:0;height:1.5pt" o:hralign="center" o:hrstd="t" o:hr="t"/>
-        </w:pict>
-      </w:r>
-    </w:p>
     <w:bookmarkEnd w:id="66"/>
     <w:bookmarkStart w:id="67" w:name="tabel-ringkasan-risiko-klaster-halal"/>
     <w:p>
@@ -13468,6 +13259,7 @@
       <w:r>
         <w:rPr>
           <w:rFonts w:ascii="Times New Roman" w:hAnsi="Times New Roman"/>
+          <w:color w:val="000000"/>
         </w:rPr>
         <w:t xml:space="preserve">4.8 Tabel Ringkasan Risiko Klaster Halal</w:t>
       </w:r>
@@ -14395,6 +14187,7 @@
       <w:r>
         <w:rPr>
           <w:rFonts w:ascii="Times New Roman" w:hAnsi="Times New Roman"/>
+          <w:color w:val="000000"/>
         </w:rPr>
         <w:t xml:space="preserve">BAB V: KESIMPULAN DAN SARAN</w:t>
       </w:r>
@@ -14407,6 +14200,7 @@
       <w:r>
         <w:rPr>
           <w:rFonts w:ascii="Times New Roman" w:hAnsi="Times New Roman"/>
+          <w:color w:val="000000"/>
         </w:rPr>
         <w:t xml:space="preserve">5.1 Kesimpulan</w:t>
       </w:r>
@@ -14829,6 +14623,7 @@
       <w:r>
         <w:rPr>
           <w:rFonts w:ascii="Times New Roman" w:hAnsi="Times New Roman"/>
+          <w:color w:val="000000"/>
         </w:rPr>
         <w:t xml:space="preserve">5.2 Saran</w:t>
       </w:r>
@@ -15038,20 +14833,6 @@
         <w:t xml:space="preserve">(E471) yang menjadi titik kritis utama pada produk-produk pangan kompleks (Klaster 8).</w:t>
       </w:r>
     </w:p>
-    <w:p>
-      <w:pPr>
-        <w:jc w:val="both"/>
-      </w:pPr>
-      <w:r>
-        <w:rPr>
-          <w:rFonts w:ascii="Times New Roman" w:hAnsi="Times New Roman"/>
-          <w:sz w:val="24"/>
-        </w:rPr>
-        <w:pict>
-          <v:rect style="width:0;height:1.5pt" o:hralign="center" o:hrstd="t" o:hr="t"/>
-        </w:pict>
-      </w:r>
-    </w:p>
     <w:bookmarkEnd w:id="70"/>
     <w:bookmarkEnd w:id="71"/>
     <w:bookmarkStart w:id="72" w:name="daftar-pustaka"/>
@@ -15062,6 +14843,7 @@
       <w:r>
         <w:rPr>
           <w:rFonts w:ascii="Times New Roman" w:hAnsi="Times New Roman"/>
+          <w:color w:val="000000"/>
         </w:rPr>
         <w:t xml:space="preserve">DAFTAR PUSTAKA</w:t>
       </w:r>
@@ -15402,20 +15184,6 @@
         <w:t xml:space="preserve">, 96, 102211.</w:t>
       </w:r>
     </w:p>
-    <w:p>
-      <w:pPr>
-        <w:jc w:val="both"/>
-      </w:pPr>
-      <w:r>
-        <w:rPr>
-          <w:rFonts w:ascii="Times New Roman" w:hAnsi="Times New Roman"/>
-          <w:sz w:val="24"/>
-        </w:rPr>
-        <w:pict>
-          <v:rect style="width:0;height:1.5pt" o:hralign="center" o:hrstd="t" o:hr="t"/>
-        </w:pict>
-      </w:r>
-    </w:p>
     <w:bookmarkEnd w:id="72"/>
     <w:bookmarkStart w:id="81" w:name="X6c949f68e861d744fc1e57c0bae665ba8ffc7c8"/>
     <w:p>
@@ -15425,6 +15193,7 @@
       <w:r>
         <w:rPr>
           <w:rFonts w:ascii="Times New Roman" w:hAnsi="Times New Roman"/>
+          <w:color w:val="000000"/>
         </w:rPr>
         <w:t xml:space="preserve">LAMPIRAN: PANDUAN ANTISIPASI PERTANYAAN UJIAN PERTAHANAN PROYEK (Q&amp;A DEFENSE PREPARATION)</w:t>
       </w:r>
@@ -15450,6 +15219,7 @@
       <w:r>
         <w:rPr>
           <w:rFonts w:ascii="Times New Roman" w:hAnsi="Times New Roman"/>
+          <w:color w:val="000000"/>
         </w:rPr>
         <w:t xml:space="preserve">Sesi A: Landasan Matematis &amp; Metodologi Reduksi Dimensi</w:t>
       </w:r>
@@ -15462,6 +15232,7 @@
       <w:r>
         <w:rPr>
           <w:rFonts w:ascii="Times New Roman" w:hAnsi="Times New Roman"/>
+          <w:color w:val="000000"/>
         </w:rPr>
         <w:t xml:space="preserve">1. Mengapa proyek ini menggunakan Multiple Correspondence Analysis (MCA), bukan Principal Component Analysis (PCA) klasik?</w:t>
       </w:r>
@@ -15763,6 +15534,7 @@
       <w:r>
         <w:rPr>
           <w:rFonts w:ascii="Times New Roman" w:hAnsi="Times New Roman"/>
+          <w:color w:val="000000"/>
         </w:rPr>
         <w:t xml:space="preserve">2. K-Means menghasilkan Silhouette Score yang jauh lebih tinggi (0.4136) dibandingkan Spectral Clustering (-0.0807). Bukankah ini membuktikan K-Means lebih baik?</w:t>
       </w:r>
@@ -16049,12 +15821,14 @@
       <w:r>
         <w:rPr>
           <w:rFonts w:ascii="Times New Roman" w:hAnsi="Times New Roman"/>
+          <w:color w:val="000000"/>
         </w:rPr>
         <w:t xml:space="preserve">3. Bagaimana Anda menentukan nilai hyperparameter KNN Adjacency Graph</w:t>
       </w:r>
       <w:r>
         <w:rPr>
           <w:rFonts w:ascii="Times New Roman" w:hAnsi="Times New Roman"/>
+          <w:color w:val="000000"/>
         </w:rPr>
         <w:t xml:space="preserve"> </w:t>
       </w:r>
@@ -16075,18 +15849,21 @@
       <w:r>
         <w:rPr>
           <w:rFonts w:ascii="Times New Roman" w:hAnsi="Times New Roman"/>
-        </w:rPr>
-        <w:t xml:space="preserve"> </w:t>
-      </w:r>
-      <w:r>
-        <w:rPr>
-          <w:rFonts w:ascii="Times New Roman" w:hAnsi="Times New Roman"/>
+          <w:color w:val="000000"/>
+        </w:rPr>
+        <w:t xml:space="preserve"> </w:t>
+      </w:r>
+      <w:r>
+        <w:rPr>
+          <w:rFonts w:ascii="Times New Roman" w:hAnsi="Times New Roman"/>
+          <w:color w:val="000000"/>
         </w:rPr>
         <w:t xml:space="preserve">dan RBF Kernel</w:t>
       </w:r>
       <w:r>
         <w:rPr>
           <w:rFonts w:ascii="Times New Roman" w:hAnsi="Times New Roman"/>
+          <w:color w:val="000000"/>
         </w:rPr>
         <w:t xml:space="preserve"> </w:t>
       </w:r>
@@ -16107,6 +15884,7 @@
       <w:r>
         <w:rPr>
           <w:rFonts w:ascii="Times New Roman" w:hAnsi="Times New Roman"/>
+          <w:color w:val="000000"/>
         </w:rPr>
         <w:t xml:space="preserve">?</w:t>
       </w:r>
@@ -16510,20 +16288,6 @@
         <w:t xml:space="preserve">berdasarkan signifikansi Greenacre). Ini menormalkan jarak Euclidean di ruang spektral sehingga bobot eksponensial graf tidak meluruh terlalu cepat menjadi nol.</w:t>
       </w:r>
     </w:p>
-    <w:p>
-      <w:pPr>
-        <w:jc w:val="both"/>
-      </w:pPr>
-      <w:r>
-        <w:rPr>
-          <w:rFonts w:ascii="Times New Roman" w:hAnsi="Times New Roman"/>
-          <w:sz w:val="24"/>
-        </w:rPr>
-        <w:pict>
-          <v:rect style="width:0;height:1.5pt" o:hralign="center" o:hrstd="t" o:hr="t"/>
-        </w:pict>
-      </w:r>
-    </w:p>
     <w:bookmarkEnd w:id="75"/>
     <w:bookmarkEnd w:id="76"/>
     <w:bookmarkStart w:id="80" w:name="X4131c911fb1dcf5ecabfeb5209583df7af83f53"/>
@@ -16534,6 +16298,7 @@
       <w:r>
         <w:rPr>
           <w:rFonts w:ascii="Times New Roman" w:hAnsi="Times New Roman"/>
+          <w:color w:val="000000"/>
         </w:rPr>
         <w:t xml:space="preserve">Sesi B: Narasi Storytelling &amp; Hasil Klasterisasi</w:t>
       </w:r>
@@ -16546,6 +16311,7 @@
       <w:r>
         <w:rPr>
           <w:rFonts w:ascii="Times New Roman" w:hAnsi="Times New Roman"/>
+          <w:color w:val="000000"/>
         </w:rPr>
         <w:t xml:space="preserve">4. Apa bukti empiris bias administratif (Data Leakage) yang Anda temukan pada sistem pelabelan halal kemasan?</w:t>
       </w:r>
@@ -16919,6 +16685,7 @@
       <w:r>
         <w:rPr>
           <w:rFonts w:ascii="Times New Roman" w:hAnsi="Times New Roman"/>
+          <w:color w:val="000000"/>
         </w:rPr>
         <w:t xml:space="preserve">5. Mengapa kompleksitas resep (jumlah bahan) berbanding lurus dengan tingkat risiko kehalalan produk? Jelaskan temuan klaster Anda.</w:t>
       </w:r>
@@ -17266,6 +17033,7 @@
       <w:r>
         <w:rPr>
           <w:rFonts w:ascii="Times New Roman" w:hAnsi="Times New Roman"/>
+          <w:color w:val="000000"/>
         </w:rPr>
         <w:t xml:space="preserve">6. Rekomendasi regulasi apa yang paling berdampak yang dihasilkan dari proyek Data Storytelling ini?</w:t>
       </w:r>
@@ -18258,6 +18026,7 @@
     </w:pPr>
     <w:rPr>
       <w:rFonts w:asciiTheme="majorHAnsi" w:cstheme="majorBidi" w:eastAsiaTheme="majorEastAsia" w:hAnsiTheme="majorHAnsi" w:ascii="Times New Roman" w:hAnsi="Times New Roman"/>
+      <w:color w:val="000000"/>
       <w:sz w:val="56"/>
       <w:szCs w:val="56"/>
     </w:rPr>
@@ -18289,6 +18058,7 @@
     </w:pPr>
     <w:rPr>
       <w:rFonts w:cstheme="majorBidi" w:eastAsiaTheme="majorEastAsia" w:ascii="Times New Roman" w:hAnsi="Times New Roman"/>
+      <w:color w:val="000000"/>
       <w:spacing w:val="15"/>
       <w:sz w:val="28"/>
       <w:szCs w:val="28"/>
@@ -18392,7 +18162,7 @@
     </w:pPr>
     <w:rPr>
       <w:rFonts w:asciiTheme="majorHAnsi" w:cstheme="majorBidi" w:eastAsiaTheme="majorEastAsia" w:hAnsiTheme="majorHAnsi" w:ascii="Times New Roman" w:hAnsi="Times New Roman"/>
-      <w:color w:themeColor="accent1" w:themeShade="BF" w:val="0F4761"/>
+      <w:color w:val="000000"/>
       <w:sz w:val="40"/>
       <w:szCs w:val="40"/>
     </w:rPr>
@@ -18415,7 +18185,7 @@
     </w:pPr>
     <w:rPr>
       <w:rFonts w:asciiTheme="majorHAnsi" w:cstheme="majorBidi" w:eastAsiaTheme="majorEastAsia" w:hAnsiTheme="majorHAnsi" w:ascii="Times New Roman" w:hAnsi="Times New Roman"/>
-      <w:color w:themeColor="accent1" w:themeShade="BF" w:val="0F4761"/>
+      <w:color w:val="000000"/>
       <w:sz w:val="32"/>
       <w:szCs w:val="32"/>
     </w:rPr>
@@ -18438,7 +18208,7 @@
     </w:pPr>
     <w:rPr>
       <w:rFonts w:cstheme="majorBidi" w:eastAsiaTheme="majorEastAsia" w:ascii="Times New Roman" w:hAnsi="Times New Roman"/>
-      <w:color w:themeColor="accent1" w:themeShade="BF" w:val="0F4761"/>
+      <w:color w:val="000000"/>
       <w:sz w:val="28"/>
       <w:szCs w:val="28"/>
     </w:rPr>
@@ -18463,7 +18233,7 @@
       <w:rFonts w:cstheme="majorBidi" w:eastAsiaTheme="majorEastAsia" w:ascii="Times New Roman" w:hAnsi="Times New Roman"/>
       <w:i/>
       <w:iCs/>
-      <w:color w:themeColor="accent1" w:themeShade="BF" w:val="0F4761"/>
+      <w:color w:val="000000"/>
     </w:rPr>
   </w:style>
   <w:style w:styleId="Heading5" w:type="paragraph">
@@ -18484,7 +18254,7 @@
     </w:pPr>
     <w:rPr>
       <w:rFonts w:cstheme="majorBidi" w:eastAsiaTheme="majorEastAsia" w:ascii="Times New Roman" w:hAnsi="Times New Roman"/>
-      <w:color w:themeColor="accent1" w:themeShade="BF" w:val="0F4761"/>
+      <w:color w:val="000000"/>
     </w:rPr>
   </w:style>
   <w:style w:styleId="Heading6" w:type="paragraph">
@@ -18507,7 +18277,7 @@
       <w:rFonts w:cstheme="majorBidi" w:eastAsiaTheme="majorEastAsia" w:ascii="Times New Roman" w:hAnsi="Times New Roman"/>
       <w:i/>
       <w:iCs/>
-      <w:color w:themeColor="text1" w:themeTint="A6" w:val="595959"/>
+      <w:color w:val="000000"/>
     </w:rPr>
   </w:style>
   <w:style w:styleId="Heading7" w:type="paragraph">

</xml_diff>